<commit_message>
[feat] update wedge force & magnetic force & penalty of algorithm
</commit_message>
<xml_diff>
--- a/研究架構_Willy.docx
+++ b/研究架構_Willy.docx
@@ -350,10 +350,10 @@
             <v:path o:extrusionok="f" gradientshapeok="t" o:connecttype="rect"/>
             <o:lock v:ext="edit" aspectratio="t"/>
           </v:shapetype>
-          <v:shape id="_x0000_i1025" type="#_x0000_t75" style="width:12pt;height:18pt" o:ole="">
+          <v:shape id="_x0000_i1025" type="#_x0000_t75" style="width:12.1pt;height:17.85pt" o:ole="">
             <v:imagedata r:id="rId8" o:title=""/>
           </v:shape>
-          <o:OLEObject Type="Embed" ProgID="Equation.DSMT4" ShapeID="_x0000_i1025" DrawAspect="Content" ObjectID="_1835707748" r:id="rId9"/>
+          <o:OLEObject Type="Embed" ProgID="Equation.DSMT4" ShapeID="_x0000_i1025" DrawAspect="Content" ObjectID="_1835817365" r:id="rId9"/>
         </w:object>
       </w:r>
       <w:r>
@@ -367,10 +367,10 @@
           <w:position w:val="-12"/>
         </w:rPr>
         <w:object w:dxaOrig="279" w:dyaOrig="360" w14:anchorId="0133F332">
-          <v:shape id="_x0000_i1026" type="#_x0000_t75" style="width:14.25pt;height:18pt" o:ole="">
+          <v:shape id="_x0000_i1026" type="#_x0000_t75" style="width:14.4pt;height:17.85pt" o:ole="">
             <v:imagedata r:id="rId10" o:title=""/>
           </v:shape>
-          <o:OLEObject Type="Embed" ProgID="Equation.DSMT4" ShapeID="_x0000_i1026" DrawAspect="Content" ObjectID="_1835707749" r:id="rId11"/>
+          <o:OLEObject Type="Embed" ProgID="Equation.DSMT4" ShapeID="_x0000_i1026" DrawAspect="Content" ObjectID="_1835817366" r:id="rId11"/>
         </w:object>
       </w:r>
       <w:r>
@@ -381,10 +381,10 @@
           <w:position w:val="-10"/>
         </w:rPr>
         <w:object w:dxaOrig="240" w:dyaOrig="260" w14:anchorId="165525E8">
-          <v:shape id="_x0000_i1027" type="#_x0000_t75" style="width:12pt;height:12.75pt" o:ole="">
+          <v:shape id="_x0000_i1027" type="#_x0000_t75" style="width:12.1pt;height:12.65pt" o:ole="">
             <v:imagedata r:id="rId12" o:title=""/>
           </v:shape>
-          <o:OLEObject Type="Embed" ProgID="Equation.DSMT4" ShapeID="_x0000_i1027" DrawAspect="Content" ObjectID="_1835707750" r:id="rId13"/>
+          <o:OLEObject Type="Embed" ProgID="Equation.DSMT4" ShapeID="_x0000_i1027" DrawAspect="Content" ObjectID="_1835817367" r:id="rId13"/>
         </w:object>
       </w:r>
       <w:r>
@@ -407,10 +407,10 @@
           <w:position w:val="-6"/>
         </w:rPr>
         <w:object w:dxaOrig="240" w:dyaOrig="220" w14:anchorId="33BBA4BA">
-          <v:shape id="_x0000_i1028" type="#_x0000_t75" style="width:12pt;height:10.5pt" o:ole="">
+          <v:shape id="_x0000_i1028" type="#_x0000_t75" style="width:12.1pt;height:10.35pt" o:ole="">
             <v:imagedata r:id="rId14" o:title=""/>
           </v:shape>
-          <o:OLEObject Type="Embed" ProgID="Equation.DSMT4" ShapeID="_x0000_i1028" DrawAspect="Content" ObjectID="_1835707751" r:id="rId15"/>
+          <o:OLEObject Type="Embed" ProgID="Equation.DSMT4" ShapeID="_x0000_i1028" DrawAspect="Content" ObjectID="_1835817368" r:id="rId15"/>
         </w:object>
       </w:r>
       <w:r>
@@ -424,10 +424,10 @@
           <w:position w:val="-10"/>
         </w:rPr>
         <w:object w:dxaOrig="220" w:dyaOrig="260" w14:anchorId="40AB4252">
-          <v:shape id="_x0000_i1029" type="#_x0000_t75" style="width:10.5pt;height:12.75pt" o:ole="">
+          <v:shape id="_x0000_i1029" type="#_x0000_t75" style="width:10.35pt;height:12.65pt" o:ole="">
             <v:imagedata r:id="rId16" o:title=""/>
           </v:shape>
-          <o:OLEObject Type="Embed" ProgID="Equation.DSMT4" ShapeID="_x0000_i1029" DrawAspect="Content" ObjectID="_1835707752" r:id="rId17"/>
+          <o:OLEObject Type="Embed" ProgID="Equation.DSMT4" ShapeID="_x0000_i1029" DrawAspect="Content" ObjectID="_1835817369" r:id="rId17"/>
         </w:object>
       </w:r>
       <w:r>
@@ -763,10 +763,10 @@
           <w:lang w:val="en-CA"/>
         </w:rPr>
         <w:object w:dxaOrig="5200" w:dyaOrig="700" w14:anchorId="227FD791">
-          <v:shape id="_x0000_i1030" type="#_x0000_t75" style="width:259.5pt;height:35.25pt" o:ole="">
+          <v:shape id="_x0000_i1030" type="#_x0000_t75" style="width:259.2pt;height:35.15pt" o:ole="">
             <v:imagedata r:id="rId19" o:title=""/>
           </v:shape>
-          <o:OLEObject Type="Embed" ProgID="Equation.DSMT4" ShapeID="_x0000_i1030" DrawAspect="Content" ObjectID="_1835707753" r:id="rId20"/>
+          <o:OLEObject Type="Embed" ProgID="Equation.DSMT4" ShapeID="_x0000_i1030" DrawAspect="Content" ObjectID="_1835817370" r:id="rId20"/>
         </w:object>
       </w:r>
     </w:p>
@@ -784,10 +784,10 @@
           <w:lang w:val="en-CA"/>
         </w:rPr>
         <w:object w:dxaOrig="2920" w:dyaOrig="380" w14:anchorId="1D7D8C9A">
-          <v:shape id="_x0000_i1031" type="#_x0000_t75" style="width:145.5pt;height:20.25pt" o:ole="">
+          <v:shape id="_x0000_i1031" type="#_x0000_t75" style="width:145.75pt;height:20.15pt" o:ole="">
             <v:imagedata r:id="rId21" o:title=""/>
           </v:shape>
-          <o:OLEObject Type="Embed" ProgID="Equation.DSMT4" ShapeID="_x0000_i1031" DrawAspect="Content" ObjectID="_1835707754" r:id="rId22"/>
+          <o:OLEObject Type="Embed" ProgID="Equation.DSMT4" ShapeID="_x0000_i1031" DrawAspect="Content" ObjectID="_1835817371" r:id="rId22"/>
         </w:object>
       </w:r>
     </w:p>
@@ -1465,10 +1465,10 @@
           <w:position w:val="-14"/>
         </w:rPr>
         <w:object w:dxaOrig="1100" w:dyaOrig="380" w14:anchorId="5E099154">
-          <v:shape id="_x0000_i1032" type="#_x0000_t75" style="width:55.5pt;height:18.75pt" o:ole="">
+          <v:shape id="_x0000_i1032" type="#_x0000_t75" style="width:55.3pt;height:19pt" o:ole="">
             <v:imagedata r:id="rId27" o:title=""/>
           </v:shape>
-          <o:OLEObject Type="Embed" ProgID="Equation.DSMT4" ShapeID="_x0000_i1032" DrawAspect="Content" ObjectID="_1835707755" r:id="rId28"/>
+          <o:OLEObject Type="Embed" ProgID="Equation.DSMT4" ShapeID="_x0000_i1032" DrawAspect="Content" ObjectID="_1835817372" r:id="rId28"/>
         </w:object>
       </w:r>
       <w:r>
@@ -1482,10 +1482,10 @@
           <w:position w:val="-14"/>
         </w:rPr>
         <w:object w:dxaOrig="1620" w:dyaOrig="380" w14:anchorId="010432FA">
-          <v:shape id="_x0000_i1033" type="#_x0000_t75" style="width:81pt;height:18.75pt" o:ole="">
+          <v:shape id="_x0000_i1033" type="#_x0000_t75" style="width:81.2pt;height:19pt" o:ole="">
             <v:imagedata r:id="rId29" o:title=""/>
           </v:shape>
-          <o:OLEObject Type="Embed" ProgID="Equation.DSMT4" ShapeID="_x0000_i1033" DrawAspect="Content" ObjectID="_1835707756" r:id="rId30"/>
+          <o:OLEObject Type="Embed" ProgID="Equation.DSMT4" ShapeID="_x0000_i1033" DrawAspect="Content" ObjectID="_1835817373" r:id="rId30"/>
         </w:object>
       </w:r>
       <w:r>
@@ -1508,10 +1508,10 @@
           <w:position w:val="-6"/>
         </w:rPr>
         <w:object w:dxaOrig="240" w:dyaOrig="220" w14:anchorId="3E081A67">
-          <v:shape id="_x0000_i1034" type="#_x0000_t75" style="width:12pt;height:10.5pt" o:ole="">
+          <v:shape id="_x0000_i1034" type="#_x0000_t75" style="width:12.1pt;height:10.35pt" o:ole="">
             <v:imagedata r:id="rId14" o:title=""/>
           </v:shape>
-          <o:OLEObject Type="Embed" ProgID="Equation.DSMT4" ShapeID="_x0000_i1034" DrawAspect="Content" ObjectID="_1835707757" r:id="rId31"/>
+          <o:OLEObject Type="Embed" ProgID="Equation.DSMT4" ShapeID="_x0000_i1034" DrawAspect="Content" ObjectID="_1835817374" r:id="rId31"/>
         </w:object>
       </w:r>
       <w:r>
@@ -1525,10 +1525,10 @@
           <w:position w:val="-10"/>
         </w:rPr>
         <w:object w:dxaOrig="220" w:dyaOrig="260" w14:anchorId="018E8CB5">
-          <v:shape id="_x0000_i1035" type="#_x0000_t75" style="width:10.5pt;height:12.75pt" o:ole="">
+          <v:shape id="_x0000_i1035" type="#_x0000_t75" style="width:10.35pt;height:12.65pt" o:ole="">
             <v:imagedata r:id="rId16" o:title=""/>
           </v:shape>
-          <o:OLEObject Type="Embed" ProgID="Equation.DSMT4" ShapeID="_x0000_i1035" DrawAspect="Content" ObjectID="_1835707758" r:id="rId32"/>
+          <o:OLEObject Type="Embed" ProgID="Equation.DSMT4" ShapeID="_x0000_i1035" DrawAspect="Content" ObjectID="_1835817375" r:id="rId32"/>
         </w:object>
       </w:r>
       <w:r>
@@ -2189,10 +2189,10 @@
                 <w:position w:val="-72"/>
               </w:rPr>
               <w:object w:dxaOrig="5580" w:dyaOrig="1560" w14:anchorId="6F351FB6">
-                <v:shape id="_x0000_i1036" type="#_x0000_t75" style="width:279pt;height:78pt" o:ole="">
+                <v:shape id="_x0000_i1036" type="#_x0000_t75" style="width:278.8pt;height:77.75pt" o:ole="">
                   <v:imagedata r:id="rId34" o:title=""/>
                 </v:shape>
-                <o:OLEObject Type="Embed" ProgID="Equation.DSMT4" ShapeID="_x0000_i1036" DrawAspect="Content" ObjectID="_1835707759" r:id="rId35"/>
+                <o:OLEObject Type="Embed" ProgID="Equation.DSMT4" ShapeID="_x0000_i1036" DrawAspect="Content" ObjectID="_1835817376" r:id="rId35"/>
               </w:object>
             </w:r>
           </w:p>
@@ -2317,6 +2317,26 @@
         <w:rPr>
           <w:rFonts w:hint="eastAsia"/>
         </w:rPr>
+        <w:t>磁石端固定，導體端旋轉的</w:t>
+      </w:r>
+      <w:proofErr w:type="gramStart"/>
+      <w:r>
+        <w:rPr>
+          <w:rFonts w:hint="eastAsia"/>
+        </w:rPr>
+        <w:t>軸向磁制動器</w:t>
+      </w:r>
+      <w:proofErr w:type="gramEnd"/>
+    </w:p>
+    <w:p>
+      <w:pPr>
+        <w:pStyle w:val="a"/>
+        <w:ind w:left="960" w:hanging="480"/>
+      </w:pPr>
+      <w:r>
+        <w:rPr>
+          <w:rFonts w:hint="eastAsia"/>
+        </w:rPr>
         <w:t>轉速帶</w:t>
       </w:r>
       <w:r>
@@ -2375,17 +2395,33 @@
           <w:lang w:val="en-CA"/>
         </w:rPr>
         <w:object w:dxaOrig="1100" w:dyaOrig="279" w14:anchorId="0AD38B19">
-          <v:shape id="_x0000_i1037" type="#_x0000_t75" style="width:54.75pt;height:14.25pt" o:ole="">
+          <v:shape id="_x0000_i1069" type="#_x0000_t75" style="width:54.7pt;height:14.4pt" o:ole="">
             <v:imagedata r:id="rId36" o:title=""/>
           </v:shape>
-          <o:OLEObject Type="Embed" ProgID="Equation.DSMT4" ShapeID="_x0000_i1037" DrawAspect="Content" ObjectID="_1835707760" r:id="rId37"/>
+          <o:OLEObject Type="Embed" ProgID="Equation.DSMT4" ShapeID="_x0000_i1069" DrawAspect="Content" ObjectID="_1835817377" r:id="rId37"/>
         </w:object>
+      </w:r>
+    </w:p>
+    <w:p>
+      <w:pPr>
+        <w:pStyle w:val="a"/>
+        <w:ind w:leftChars="0" w:left="960" w:firstLineChars="0" w:hanging="480"/>
+        <w:rPr>
+          <w:rFonts w:ascii="標楷體" w:hAnsi="標楷體" w:hint="eastAsia"/>
+        </w:rPr>
+      </w:pPr>
+      <w:r>
+        <w:rPr>
+          <w:rFonts w:ascii="標楷體" w:hAnsi="標楷體" w:hint="eastAsia"/>
+          <w:lang w:val="en-CA"/>
+        </w:rPr>
+        <w:t>採用壓縮彈簧</w:t>
       </w:r>
     </w:p>
     <w:tbl>
       <w:tblPr>
         <w:tblStyle w:val="af"/>
-        <w:tblW w:w="8364" w:type="dxa"/>
+        <w:tblW w:w="8505" w:type="dxa"/>
         <w:jc w:val="center"/>
         <w:tblBorders>
           <w:top w:val="none" w:sz="0" w:space="0" w:color="auto"/>
@@ -2400,14 +2436,14 @@
       </w:tblPr>
       <w:tblGrid>
         <w:gridCol w:w="1276"/>
-        <w:gridCol w:w="850"/>
-        <w:gridCol w:w="1418"/>
+        <w:gridCol w:w="992"/>
+        <w:gridCol w:w="1276"/>
         <w:gridCol w:w="709"/>
         <w:gridCol w:w="236"/>
         <w:gridCol w:w="1039"/>
-        <w:gridCol w:w="851"/>
+        <w:gridCol w:w="993"/>
         <w:gridCol w:w="1276"/>
-        <w:gridCol w:w="709"/>
+        <w:gridCol w:w="708"/>
       </w:tblGrid>
       <w:tr>
         <w:trPr>
@@ -2415,7 +2451,7 @@
         </w:trPr>
         <w:tc>
           <w:tcPr>
-            <w:tcW w:w="8364" w:type="dxa"/>
+            <w:tcW w:w="8505" w:type="dxa"/>
             <w:gridSpan w:val="9"/>
           </w:tcPr>
           <w:p>
@@ -2423,59 +2459,101 @@
               <w:pStyle w:val="af0"/>
               <w:jc w:val="center"/>
               <w:rPr>
+                <w:sz w:val="24"/>
+                <w:szCs w:val="24"/>
                 <w:lang w:val="en-CA"/>
               </w:rPr>
             </w:pPr>
             <w:r>
               <w:rPr>
                 <w:rFonts w:hint="eastAsia"/>
+                <w:sz w:val="24"/>
+                <w:szCs w:val="24"/>
               </w:rPr>
               <w:t>表</w:t>
             </w:r>
             <w:r>
+              <w:rPr>
+                <w:sz w:val="24"/>
+                <w:szCs w:val="24"/>
+              </w:rPr>
               <w:fldChar w:fldCharType="begin"/>
             </w:r>
             <w:r>
+              <w:rPr>
+                <w:sz w:val="24"/>
+                <w:szCs w:val="24"/>
+              </w:rPr>
               <w:instrText xml:space="preserve"> </w:instrText>
             </w:r>
             <w:r>
               <w:rPr>
                 <w:rFonts w:hint="eastAsia"/>
+                <w:sz w:val="24"/>
+                <w:szCs w:val="24"/>
               </w:rPr>
               <w:instrText xml:space="preserve">SEQ </w:instrText>
             </w:r>
             <w:r>
               <w:rPr>
                 <w:rFonts w:hint="eastAsia"/>
+                <w:sz w:val="24"/>
+                <w:szCs w:val="24"/>
               </w:rPr>
               <w:instrText>表</w:instrText>
             </w:r>
             <w:r>
               <w:rPr>
                 <w:rFonts w:hint="eastAsia"/>
+                <w:sz w:val="24"/>
+                <w:szCs w:val="24"/>
               </w:rPr>
               <w:instrText xml:space="preserve"> \* ARABIC</w:instrText>
             </w:r>
             <w:r>
+              <w:rPr>
+                <w:sz w:val="24"/>
+                <w:szCs w:val="24"/>
+              </w:rPr>
               <w:instrText xml:space="preserve"> </w:instrText>
             </w:r>
             <w:r>
+              <w:rPr>
+                <w:sz w:val="24"/>
+                <w:szCs w:val="24"/>
+              </w:rPr>
               <w:fldChar w:fldCharType="separate"/>
             </w:r>
             <w:r>
               <w:rPr>
                 <w:noProof/>
+                <w:sz w:val="24"/>
+                <w:szCs w:val="24"/>
               </w:rPr>
               <w:t>1</w:t>
             </w:r>
             <w:r>
+              <w:rPr>
+                <w:sz w:val="24"/>
+                <w:szCs w:val="24"/>
+              </w:rPr>
               <w:fldChar w:fldCharType="end"/>
             </w:r>
             <w:r>
               <w:rPr>
                 <w:rFonts w:hint="eastAsia"/>
+                <w:sz w:val="24"/>
+                <w:szCs w:val="24"/>
               </w:rPr>
               <w:t>、</w:t>
+            </w:r>
+            <w:r>
+              <w:rPr>
+                <w:rFonts w:hint="eastAsia"/>
+                <w:sz w:val="24"/>
+                <w:szCs w:val="24"/>
+              </w:rPr>
+              <w:t>各物件材質與尺寸</w:t>
             </w:r>
           </w:p>
         </w:tc>
@@ -2486,7 +2564,7 @@
         </w:trPr>
         <w:tc>
           <w:tcPr>
-            <w:tcW w:w="2126" w:type="dxa"/>
+            <w:tcW w:w="2268" w:type="dxa"/>
             <w:gridSpan w:val="2"/>
             <w:tcBorders>
               <w:top w:val="single" w:sz="12" w:space="0" w:color="auto"/>
@@ -2517,7 +2595,7 @@
         </w:tc>
         <w:tc>
           <w:tcPr>
-            <w:tcW w:w="1418" w:type="dxa"/>
+            <w:tcW w:w="1276" w:type="dxa"/>
             <w:tcBorders>
               <w:top w:val="single" w:sz="12" w:space="0" w:color="auto"/>
               <w:bottom w:val="single" w:sz="4" w:space="0" w:color="auto"/>
@@ -2595,7 +2673,7 @@
         </w:tc>
         <w:tc>
           <w:tcPr>
-            <w:tcW w:w="1890" w:type="dxa"/>
+            <w:tcW w:w="2032" w:type="dxa"/>
             <w:gridSpan w:val="2"/>
             <w:tcBorders>
               <w:top w:val="single" w:sz="12" w:space="0" w:color="auto"/>
@@ -2656,7 +2734,7 @@
         </w:tc>
         <w:tc>
           <w:tcPr>
-            <w:tcW w:w="709" w:type="dxa"/>
+            <w:tcW w:w="708" w:type="dxa"/>
             <w:tcBorders>
               <w:top w:val="single" w:sz="12" w:space="0" w:color="auto"/>
               <w:bottom w:val="single" w:sz="4" w:space="0" w:color="auto"/>
@@ -2723,7 +2801,7 @@
         </w:tc>
         <w:tc>
           <w:tcPr>
-            <w:tcW w:w="850" w:type="dxa"/>
+            <w:tcW w:w="992" w:type="dxa"/>
             <w:tcBorders>
               <w:top w:val="single" w:sz="4" w:space="0" w:color="auto"/>
             </w:tcBorders>
@@ -2746,13 +2824,27 @@
                 <w:rFonts w:hint="eastAsia"/>
                 <w:lang w:val="en-CA"/>
               </w:rPr>
-              <w:t>外徑</w:t>
-            </w:r>
-          </w:p>
-        </w:tc>
-        <w:tc>
-          <w:tcPr>
-            <w:tcW w:w="1418" w:type="dxa"/>
+              <w:t>外</w:t>
+            </w:r>
+            <w:r>
+              <w:rPr>
+                <w:rFonts w:hint="eastAsia"/>
+                <w:lang w:val="en-CA"/>
+              </w:rPr>
+              <w:t>半</w:t>
+            </w:r>
+            <w:r>
+              <w:rPr>
+                <w:rFonts w:hint="eastAsia"/>
+                <w:lang w:val="en-CA"/>
+              </w:rPr>
+              <w:t>徑</w:t>
+            </w:r>
+          </w:p>
+        </w:tc>
+        <w:tc>
+          <w:tcPr>
+            <w:tcW w:w="1276" w:type="dxa"/>
             <w:tcBorders>
               <w:top w:val="single" w:sz="4" w:space="0" w:color="auto"/>
             </w:tcBorders>
@@ -2774,9 +2866,15 @@
               <m:oMath>
                 <m:r>
                   <w:rPr>
+                    <w:rFonts w:ascii="Cambria Math" w:hAnsi="Cambria Math" w:hint="eastAsia"/>
+                  </w:rPr>
+                  <m:t>5</m:t>
+                </m:r>
+                <m:r>
+                  <w:rPr>
                     <w:rFonts w:ascii="Cambria Math" w:hAnsi="Cambria Math"/>
                   </w:rPr>
-                  <m:t>40-1</m:t>
+                  <m:t>0-1</m:t>
                 </m:r>
                 <m:r>
                   <w:rPr>
@@ -2846,6 +2944,7 @@
             <w:vMerge w:val="restart"/>
             <w:tcBorders>
               <w:top w:val="single" w:sz="4" w:space="0" w:color="auto"/>
+              <w:bottom w:val="single" w:sz="4" w:space="0" w:color="auto"/>
             </w:tcBorders>
             <w:vAlign w:val="center"/>
           </w:tcPr>
@@ -2858,21 +2957,22 @@
               </w:numPr>
               <w:jc w:val="center"/>
               <w:rPr>
-                <w:lang w:val="en-CA"/>
-              </w:rPr>
-            </w:pPr>
-            <w:r>
-              <w:rPr>
                 <w:rFonts w:hint="eastAsia"/>
                 <w:lang w:val="en-CA"/>
               </w:rPr>
-              <w:t>磁石</w:t>
-            </w:r>
-          </w:p>
-        </w:tc>
-        <w:tc>
-          <w:tcPr>
-            <w:tcW w:w="851" w:type="dxa"/>
+            </w:pPr>
+            <w:r>
+              <w:rPr>
+                <w:rFonts w:hint="eastAsia"/>
+                <w:lang w:val="en-CA"/>
+              </w:rPr>
+              <w:t>導體</w:t>
+            </w:r>
+          </w:p>
+        </w:tc>
+        <w:tc>
+          <w:tcPr>
+            <w:tcW w:w="993" w:type="dxa"/>
             <w:tcBorders>
               <w:top w:val="single" w:sz="4" w:space="0" w:color="auto"/>
             </w:tcBorders>
@@ -2895,7 +2995,21 @@
                 <w:rFonts w:hint="eastAsia"/>
                 <w:lang w:val="en-CA"/>
               </w:rPr>
-              <w:t>長</w:t>
+              <w:t>外</w:t>
+            </w:r>
+            <w:r>
+              <w:rPr>
+                <w:rFonts w:hint="eastAsia"/>
+                <w:lang w:val="en-CA"/>
+              </w:rPr>
+              <w:t>半</w:t>
+            </w:r>
+            <w:r>
+              <w:rPr>
+                <w:rFonts w:hint="eastAsia"/>
+                <w:lang w:val="en-CA"/>
+              </w:rPr>
+              <w:t>徑</w:t>
             </w:r>
           </w:p>
         </w:tc>
@@ -2923,9 +3037,15 @@
               <m:oMath>
                 <m:r>
                   <w:rPr>
+                    <w:rFonts w:ascii="Cambria Math" w:hAnsi="Cambria Math" w:hint="eastAsia"/>
+                  </w:rPr>
+                  <m:t>5</m:t>
+                </m:r>
+                <m:r>
+                  <w:rPr>
                     <w:rFonts w:ascii="Cambria Math" w:hAnsi="Cambria Math"/>
                   </w:rPr>
-                  <m:t>15-50</m:t>
+                  <m:t>0-100</m:t>
                 </m:r>
               </m:oMath>
             </m:oMathPara>
@@ -2933,7 +3053,7 @@
         </w:tc>
         <w:tc>
           <w:tcPr>
-            <w:tcW w:w="709" w:type="dxa"/>
+            <w:tcW w:w="708" w:type="dxa"/>
             <w:tcBorders>
               <w:top w:val="single" w:sz="4" w:space="0" w:color="auto"/>
             </w:tcBorders>
@@ -2986,7 +3106,7 @@
         </w:tc>
         <w:tc>
           <w:tcPr>
-            <w:tcW w:w="850" w:type="dxa"/>
+            <w:tcW w:w="992" w:type="dxa"/>
             <w:vAlign w:val="center"/>
           </w:tcPr>
           <w:p>
@@ -3012,7 +3132,7 @@
         </w:tc>
         <w:tc>
           <w:tcPr>
-            <w:tcW w:w="1418" w:type="dxa"/>
+            <w:tcW w:w="1276" w:type="dxa"/>
             <w:vAlign w:val="center"/>
           </w:tcPr>
           <w:p>
@@ -3032,7 +3152,163 @@
                 <m:r>
                   <w:rPr>
                     <w:rFonts w:ascii="Cambria Math" w:hAnsi="Cambria Math" w:hint="eastAsia"/>
-                    <w:color w:val="EE0000"/>
+                    <w:lang w:val="en-CA"/>
+                  </w:rPr>
+                  <m:t>14</m:t>
+                </m:r>
+                <m:r>
+                  <w:rPr>
+                    <w:rFonts w:ascii="Cambria Math" w:hAnsi="Cambria Math" w:cs="Cambria Math"/>
+                    <w:lang w:val="en-CA"/>
+                  </w:rPr>
+                  <m:t>-</m:t>
+                </m:r>
+                <m:r>
+                  <w:rPr>
+                    <w:rFonts w:ascii="Cambria Math" w:hAnsi="Cambria Math" w:cs="Cambria Math" w:hint="eastAsia"/>
+                    <w:lang w:val="en-CA"/>
+                  </w:rPr>
+                  <m:t>2</m:t>
+                </m:r>
+                <m:r>
+                  <w:rPr>
+                    <w:rFonts w:ascii="Cambria Math" w:hAnsi="Cambria Math" w:hint="eastAsia"/>
+                    <w:lang w:val="en-CA"/>
+                  </w:rPr>
+                  <m:t>0</m:t>
+                </m:r>
+              </m:oMath>
+            </m:oMathPara>
+          </w:p>
+        </w:tc>
+        <w:tc>
+          <w:tcPr>
+            <w:tcW w:w="709" w:type="dxa"/>
+            <w:vAlign w:val="center"/>
+          </w:tcPr>
+          <w:p>
+            <w:pPr>
+              <w:pStyle w:val="a"/>
+              <w:numPr>
+                <w:ilvl w:val="0"/>
+                <w:numId w:val="0"/>
+              </w:numPr>
+              <w:jc w:val="center"/>
+              <w:rPr>
+                <w:lang w:val="en-CA"/>
+              </w:rPr>
+            </w:pPr>
+            <w:r>
+              <w:rPr>
+                <w:lang w:val="en-CA"/>
+              </w:rPr>
+              <w:t>mm</w:t>
+            </w:r>
+          </w:p>
+        </w:tc>
+        <w:tc>
+          <w:tcPr>
+            <w:tcW w:w="236" w:type="dxa"/>
+          </w:tcPr>
+          <w:p>
+            <w:pPr>
+              <w:pStyle w:val="a"/>
+              <w:numPr>
+                <w:ilvl w:val="0"/>
+                <w:numId w:val="0"/>
+              </w:numPr>
+              <w:jc w:val="center"/>
+              <w:rPr>
+                <w:lang w:val="en-CA"/>
+              </w:rPr>
+            </w:pPr>
+          </w:p>
+        </w:tc>
+        <w:tc>
+          <w:tcPr>
+            <w:tcW w:w="1039" w:type="dxa"/>
+            <w:vMerge/>
+            <w:tcBorders>
+              <w:bottom w:val="single" w:sz="4" w:space="0" w:color="auto"/>
+            </w:tcBorders>
+            <w:vAlign w:val="center"/>
+          </w:tcPr>
+          <w:p>
+            <w:pPr>
+              <w:pStyle w:val="a"/>
+              <w:numPr>
+                <w:ilvl w:val="0"/>
+                <w:numId w:val="0"/>
+              </w:numPr>
+              <w:jc w:val="center"/>
+              <w:rPr>
+                <w:lang w:val="en-CA"/>
+              </w:rPr>
+            </w:pPr>
+          </w:p>
+        </w:tc>
+        <w:tc>
+          <w:tcPr>
+            <w:tcW w:w="993" w:type="dxa"/>
+            <w:vAlign w:val="center"/>
+          </w:tcPr>
+          <w:p>
+            <w:pPr>
+              <w:pStyle w:val="a"/>
+              <w:numPr>
+                <w:ilvl w:val="0"/>
+                <w:numId w:val="0"/>
+              </w:numPr>
+              <w:jc w:val="center"/>
+              <w:rPr>
+                <w:lang w:val="en-CA"/>
+              </w:rPr>
+            </w:pPr>
+            <w:r>
+              <w:rPr>
+                <w:rFonts w:hint="eastAsia"/>
+                <w:lang w:val="en-CA"/>
+              </w:rPr>
+              <w:t>內</w:t>
+            </w:r>
+            <w:r>
+              <w:rPr>
+                <w:rFonts w:hint="eastAsia"/>
+                <w:lang w:val="en-CA"/>
+              </w:rPr>
+              <w:t>半</w:t>
+            </w:r>
+            <w:r>
+              <w:rPr>
+                <w:rFonts w:hint="eastAsia"/>
+                <w:lang w:val="en-CA"/>
+              </w:rPr>
+              <w:t>徑</w:t>
+            </w:r>
+          </w:p>
+        </w:tc>
+        <w:tc>
+          <w:tcPr>
+            <w:tcW w:w="1276" w:type="dxa"/>
+            <w:vAlign w:val="center"/>
+          </w:tcPr>
+          <w:p>
+            <w:pPr>
+              <w:pStyle w:val="a"/>
+              <w:numPr>
+                <w:ilvl w:val="0"/>
+                <w:numId w:val="0"/>
+              </w:numPr>
+              <w:jc w:val="center"/>
+              <w:rPr>
+                <w:lang w:val="en-CA"/>
+              </w:rPr>
+            </w:pPr>
+            <m:oMathPara>
+              <m:oMath>
+                <m:r>
+                  <w:rPr>
+                    <w:rFonts w:ascii="Cambria Math" w:hAnsi="Cambria Math" w:cs="Cambria Math" w:hint="eastAsia"/>
                     <w:lang w:val="en-CA"/>
                   </w:rPr>
                   <m:t>14</m:t>
@@ -3049,7 +3325,14 @@
                     <w:rFonts w:ascii="Cambria Math" w:hAnsi="Cambria Math" w:hint="eastAsia"/>
                     <w:lang w:val="en-CA"/>
                   </w:rPr>
-                  <m:t>40</m:t>
+                  <m:t>2</m:t>
+                </m:r>
+                <m:r>
+                  <w:rPr>
+                    <w:rFonts w:ascii="Cambria Math" w:hAnsi="Cambria Math" w:hint="eastAsia"/>
+                    <w:lang w:val="en-CA"/>
+                  </w:rPr>
+                  <m:t>0</m:t>
                 </m:r>
               </m:oMath>
             </m:oMathPara>
@@ -3057,7 +3340,7 @@
         </w:tc>
         <w:tc>
           <w:tcPr>
-            <w:tcW w:w="709" w:type="dxa"/>
+            <w:tcW w:w="708" w:type="dxa"/>
             <w:vAlign w:val="center"/>
           </w:tcPr>
           <w:p>
@@ -3080,9 +3363,16 @@
             </w:r>
           </w:p>
         </w:tc>
-        <w:tc>
-          <w:tcPr>
-            <w:tcW w:w="236" w:type="dxa"/>
+      </w:tr>
+      <w:tr>
+        <w:trPr>
+          <w:jc w:val="center"/>
+        </w:trPr>
+        <w:tc>
+          <w:tcPr>
+            <w:tcW w:w="1276" w:type="dxa"/>
+            <w:vMerge/>
+            <w:vAlign w:val="center"/>
           </w:tcPr>
           <w:p>
             <w:pPr>
@@ -3100,8 +3390,7 @@
         </w:tc>
         <w:tc>
           <w:tcPr>
-            <w:tcW w:w="1039" w:type="dxa"/>
-            <w:vMerge/>
+            <w:tcW w:w="992" w:type="dxa"/>
             <w:vAlign w:val="center"/>
           </w:tcPr>
           <w:p>
@@ -3116,132 +3405,18 @@
                 <w:lang w:val="en-CA"/>
               </w:rPr>
             </w:pPr>
-          </w:p>
-        </w:tc>
-        <w:tc>
-          <w:tcPr>
-            <w:tcW w:w="851" w:type="dxa"/>
-            <w:vAlign w:val="center"/>
-          </w:tcPr>
-          <w:p>
-            <w:pPr>
-              <w:pStyle w:val="a"/>
-              <w:numPr>
-                <w:ilvl w:val="0"/>
-                <w:numId w:val="0"/>
-              </w:numPr>
-              <w:jc w:val="center"/>
-              <w:rPr>
-                <w:lang w:val="en-CA"/>
-              </w:rPr>
-            </w:pPr>
             <w:r>
               <w:rPr>
                 <w:rFonts w:hint="eastAsia"/>
                 <w:lang w:val="en-CA"/>
               </w:rPr>
-              <w:t>寬</w:t>
+              <w:t>厚度</w:t>
             </w:r>
           </w:p>
         </w:tc>
         <w:tc>
           <w:tcPr>
             <w:tcW w:w="1276" w:type="dxa"/>
-            <w:vAlign w:val="center"/>
-          </w:tcPr>
-          <w:p>
-            <w:pPr>
-              <w:pStyle w:val="a"/>
-              <w:numPr>
-                <w:ilvl w:val="0"/>
-                <w:numId w:val="0"/>
-              </w:numPr>
-              <w:jc w:val="center"/>
-              <w:rPr>
-                <w:lang w:val="en-CA"/>
-              </w:rPr>
-            </w:pPr>
-          </w:p>
-        </w:tc>
-        <w:tc>
-          <w:tcPr>
-            <w:tcW w:w="709" w:type="dxa"/>
-            <w:vAlign w:val="center"/>
-          </w:tcPr>
-          <w:p>
-            <w:pPr>
-              <w:pStyle w:val="a"/>
-              <w:numPr>
-                <w:ilvl w:val="0"/>
-                <w:numId w:val="0"/>
-              </w:numPr>
-              <w:jc w:val="center"/>
-              <w:rPr>
-                <w:lang w:val="en-CA"/>
-              </w:rPr>
-            </w:pPr>
-            <w:r>
-              <w:rPr>
-                <w:lang w:val="en-CA"/>
-              </w:rPr>
-              <w:t>mm</w:t>
-            </w:r>
-          </w:p>
-        </w:tc>
-      </w:tr>
-      <w:tr>
-        <w:trPr>
-          <w:jc w:val="center"/>
-        </w:trPr>
-        <w:tc>
-          <w:tcPr>
-            <w:tcW w:w="1276" w:type="dxa"/>
-            <w:vMerge/>
-            <w:vAlign w:val="center"/>
-          </w:tcPr>
-          <w:p>
-            <w:pPr>
-              <w:pStyle w:val="a"/>
-              <w:numPr>
-                <w:ilvl w:val="0"/>
-                <w:numId w:val="0"/>
-              </w:numPr>
-              <w:jc w:val="center"/>
-              <w:rPr>
-                <w:lang w:val="en-CA"/>
-              </w:rPr>
-            </w:pPr>
-          </w:p>
-        </w:tc>
-        <w:tc>
-          <w:tcPr>
-            <w:tcW w:w="850" w:type="dxa"/>
-            <w:vAlign w:val="center"/>
-          </w:tcPr>
-          <w:p>
-            <w:pPr>
-              <w:pStyle w:val="a"/>
-              <w:numPr>
-                <w:ilvl w:val="0"/>
-                <w:numId w:val="0"/>
-              </w:numPr>
-              <w:jc w:val="center"/>
-              <w:rPr>
-                <w:lang w:val="en-CA"/>
-              </w:rPr>
-            </w:pPr>
-            <w:r>
-              <w:rPr>
-                <w:rFonts w:hint="eastAsia"/>
-                <w:lang w:val="en-CA"/>
-              </w:rPr>
-              <w:t>厚度</w:t>
-            </w:r>
-          </w:p>
-        </w:tc>
-        <w:tc>
-          <w:tcPr>
-            <w:tcW w:w="1418" w:type="dxa"/>
             <w:vAlign w:val="center"/>
           </w:tcPr>
           <w:p>
@@ -3321,6 +3496,9 @@
           <w:tcPr>
             <w:tcW w:w="1039" w:type="dxa"/>
             <w:vMerge/>
+            <w:tcBorders>
+              <w:bottom w:val="single" w:sz="4" w:space="0" w:color="auto"/>
+            </w:tcBorders>
             <w:vAlign w:val="center"/>
           </w:tcPr>
           <w:p>
@@ -3339,7 +3517,7 @@
         </w:tc>
         <w:tc>
           <w:tcPr>
-            <w:tcW w:w="851" w:type="dxa"/>
+            <w:tcW w:w="993" w:type="dxa"/>
             <w:vAlign w:val="center"/>
           </w:tcPr>
           <w:p>
@@ -3386,7 +3564,7 @@
                   <w:rPr>
                     <w:rFonts w:ascii="Cambria Math" w:hAnsi="Cambria Math"/>
                   </w:rPr>
-                  <m:t>1-9</m:t>
+                  <m:t>0.5-5</m:t>
                 </m:r>
               </m:oMath>
             </m:oMathPara>
@@ -3394,7 +3572,7 @@
         </w:tc>
         <w:tc>
           <w:tcPr>
-            <w:tcW w:w="709" w:type="dxa"/>
+            <w:tcW w:w="708" w:type="dxa"/>
             <w:vAlign w:val="center"/>
           </w:tcPr>
           <w:p>
@@ -3447,7 +3625,7 @@
         </w:tc>
         <w:tc>
           <w:tcPr>
-            <w:tcW w:w="850" w:type="dxa"/>
+            <w:tcW w:w="992" w:type="dxa"/>
             <w:tcBorders>
               <w:bottom w:val="single" w:sz="4" w:space="0" w:color="000000"/>
             </w:tcBorders>
@@ -3476,7 +3654,7 @@
         </w:tc>
         <w:tc>
           <w:tcPr>
-            <w:tcW w:w="1418" w:type="dxa"/>
+            <w:tcW w:w="1276" w:type="dxa"/>
             <w:tcBorders>
               <w:bottom w:val="single" w:sz="4" w:space="0" w:color="000000"/>
             </w:tcBorders>
@@ -3554,7 +3732,7 @@
             <w:tcW w:w="1039" w:type="dxa"/>
             <w:vMerge/>
             <w:tcBorders>
-              <w:bottom w:val="single" w:sz="4" w:space="0" w:color="000000"/>
+              <w:bottom w:val="single" w:sz="4" w:space="0" w:color="auto"/>
             </w:tcBorders>
             <w:vAlign w:val="center"/>
           </w:tcPr>
@@ -3574,10 +3752,7 @@
         </w:tc>
         <w:tc>
           <w:tcPr>
-            <w:tcW w:w="851" w:type="dxa"/>
-            <w:tcBorders>
-              <w:bottom w:val="single" w:sz="4" w:space="0" w:color="000000"/>
-            </w:tcBorders>
+            <w:tcW w:w="993" w:type="dxa"/>
             <w:vAlign w:val="center"/>
           </w:tcPr>
           <w:p>
@@ -3604,9 +3779,6 @@
         <w:tc>
           <w:tcPr>
             <w:tcW w:w="1276" w:type="dxa"/>
-            <w:tcBorders>
-              <w:bottom w:val="single" w:sz="4" w:space="0" w:color="000000"/>
-            </w:tcBorders>
             <w:vAlign w:val="center"/>
           </w:tcPr>
           <w:p>
@@ -3625,16 +3797,13 @@
               <w:rPr>
                 <w:rFonts w:hint="eastAsia"/>
               </w:rPr>
-              <w:t>FeNdB-40</w:t>
-            </w:r>
-          </w:p>
-        </w:tc>
-        <w:tc>
-          <w:tcPr>
-            <w:tcW w:w="709" w:type="dxa"/>
-            <w:tcBorders>
-              <w:bottom w:val="single" w:sz="4" w:space="0" w:color="000000"/>
-            </w:tcBorders>
+              <w:t>1060-Al</w:t>
+            </w:r>
+          </w:p>
+        </w:tc>
+        <w:tc>
+          <w:tcPr>
+            <w:tcW w:w="708" w:type="dxa"/>
             <w:vAlign w:val="center"/>
           </w:tcPr>
           <w:p>
@@ -3669,6 +3838,7 @@
             <w:vMerge w:val="restart"/>
             <w:tcBorders>
               <w:top w:val="single" w:sz="4" w:space="0" w:color="000000"/>
+              <w:bottom w:val="single" w:sz="4" w:space="0" w:color="auto"/>
             </w:tcBorders>
             <w:vAlign w:val="center"/>
           </w:tcPr>
@@ -3689,16 +3859,13 @@
                 <w:rFonts w:hint="eastAsia"/>
                 <w:lang w:val="en-CA"/>
               </w:rPr>
-              <w:t>導體</w:t>
-            </w:r>
-          </w:p>
-        </w:tc>
-        <w:tc>
-          <w:tcPr>
-            <w:tcW w:w="850" w:type="dxa"/>
-            <w:tcBorders>
-              <w:top w:val="single" w:sz="4" w:space="0" w:color="000000"/>
-            </w:tcBorders>
+              <w:t>磁石</w:t>
+            </w:r>
+          </w:p>
+        </w:tc>
+        <w:tc>
+          <w:tcPr>
+            <w:tcW w:w="992" w:type="dxa"/>
             <w:vAlign w:val="center"/>
           </w:tcPr>
           <w:p>
@@ -3718,16 +3885,13 @@
                 <w:rFonts w:hint="eastAsia"/>
                 <w:lang w:val="en-CA"/>
               </w:rPr>
-              <w:t>外徑</w:t>
-            </w:r>
-          </w:p>
-        </w:tc>
-        <w:tc>
-          <w:tcPr>
-            <w:tcW w:w="1418" w:type="dxa"/>
-            <w:tcBorders>
-              <w:top w:val="single" w:sz="4" w:space="0" w:color="000000"/>
-            </w:tcBorders>
+              <w:t>長</w:t>
+            </w:r>
+          </w:p>
+        </w:tc>
+        <w:tc>
+          <w:tcPr>
+            <w:tcW w:w="1276" w:type="dxa"/>
             <w:vAlign w:val="center"/>
           </w:tcPr>
           <w:p>
@@ -3742,24 +3906,11 @@
                 <w:lang w:val="en-CA"/>
               </w:rPr>
             </w:pPr>
-            <m:oMathPara>
-              <m:oMath>
-                <m:r>
-                  <w:rPr>
-                    <w:rFonts w:ascii="Cambria Math" w:hAnsi="Cambria Math"/>
-                  </w:rPr>
-                  <m:t>40-100</m:t>
-                </m:r>
-              </m:oMath>
-            </m:oMathPara>
           </w:p>
         </w:tc>
         <w:tc>
           <w:tcPr>
             <w:tcW w:w="709" w:type="dxa"/>
-            <w:tcBorders>
-              <w:top w:val="single" w:sz="4" w:space="0" w:color="000000"/>
-            </w:tcBorders>
             <w:vAlign w:val="center"/>
           </w:tcPr>
           <w:p>
@@ -3805,7 +3956,8 @@
             <w:tcW w:w="1039" w:type="dxa"/>
             <w:vMerge w:val="restart"/>
             <w:tcBorders>
-              <w:top w:val="single" w:sz="4" w:space="0" w:color="000000"/>
+              <w:top w:val="single" w:sz="4" w:space="0" w:color="auto"/>
+              <w:bottom w:val="single" w:sz="4" w:space="0" w:color="auto"/>
             </w:tcBorders>
             <w:vAlign w:val="center"/>
           </w:tcPr>
@@ -3832,9 +3984,9 @@
         </w:tc>
         <w:tc>
           <w:tcPr>
-            <w:tcW w:w="851" w:type="dxa"/>
+            <w:tcW w:w="993" w:type="dxa"/>
             <w:tcBorders>
-              <w:top w:val="single" w:sz="4" w:space="0" w:color="000000"/>
+              <w:top w:val="single" w:sz="4" w:space="0" w:color="auto"/>
             </w:tcBorders>
             <w:vAlign w:val="center"/>
           </w:tcPr>
@@ -3863,7 +4015,7 @@
           <w:tcPr>
             <w:tcW w:w="1276" w:type="dxa"/>
             <w:tcBorders>
-              <w:top w:val="single" w:sz="4" w:space="0" w:color="000000"/>
+              <w:top w:val="single" w:sz="4" w:space="0" w:color="auto"/>
             </w:tcBorders>
             <w:vAlign w:val="center"/>
           </w:tcPr>
@@ -3879,113 +4031,14 @@
                 <w:lang w:val="en-CA"/>
               </w:rPr>
             </w:pPr>
-          </w:p>
-        </w:tc>
-        <w:tc>
-          <w:tcPr>
-            <w:tcW w:w="709" w:type="dxa"/>
-            <w:tcBorders>
-              <w:top w:val="single" w:sz="4" w:space="0" w:color="000000"/>
-            </w:tcBorders>
-            <w:vAlign w:val="center"/>
-          </w:tcPr>
-          <w:p>
-            <w:pPr>
-              <w:pStyle w:val="a"/>
-              <w:numPr>
-                <w:ilvl w:val="0"/>
-                <w:numId w:val="0"/>
-              </w:numPr>
-              <w:jc w:val="center"/>
-              <w:rPr>
-                <w:lang w:val="en-CA"/>
-              </w:rPr>
-            </w:pPr>
-            <w:r>
-              <w:rPr>
-                <w:lang w:val="en-CA"/>
-              </w:rPr>
-              <w:t>mm</w:t>
-            </w:r>
-          </w:p>
-        </w:tc>
-      </w:tr>
-      <w:tr>
-        <w:trPr>
-          <w:jc w:val="center"/>
-        </w:trPr>
-        <w:tc>
-          <w:tcPr>
-            <w:tcW w:w="1276" w:type="dxa"/>
-            <w:vMerge/>
-            <w:vAlign w:val="center"/>
-          </w:tcPr>
-          <w:p>
-            <w:pPr>
-              <w:pStyle w:val="a"/>
-              <w:numPr>
-                <w:ilvl w:val="0"/>
-                <w:numId w:val="0"/>
-              </w:numPr>
-              <w:jc w:val="center"/>
-              <w:rPr>
-                <w:lang w:val="en-CA"/>
-              </w:rPr>
-            </w:pPr>
-          </w:p>
-        </w:tc>
-        <w:tc>
-          <w:tcPr>
-            <w:tcW w:w="850" w:type="dxa"/>
-            <w:vAlign w:val="center"/>
-          </w:tcPr>
-          <w:p>
-            <w:pPr>
-              <w:pStyle w:val="a"/>
-              <w:numPr>
-                <w:ilvl w:val="0"/>
-                <w:numId w:val="0"/>
-              </w:numPr>
-              <w:jc w:val="center"/>
-              <w:rPr>
-                <w:lang w:val="en-CA"/>
-              </w:rPr>
-            </w:pPr>
-            <w:r>
-              <w:rPr>
-                <w:rFonts w:hint="eastAsia"/>
-                <w:lang w:val="en-CA"/>
-              </w:rPr>
-              <w:t>內徑</w:t>
-            </w:r>
-          </w:p>
-        </w:tc>
-        <w:tc>
-          <w:tcPr>
-            <w:tcW w:w="1418" w:type="dxa"/>
-            <w:vAlign w:val="center"/>
-          </w:tcPr>
-          <w:p>
-            <w:pPr>
-              <w:pStyle w:val="a"/>
-              <w:numPr>
-                <w:ilvl w:val="0"/>
-                <w:numId w:val="0"/>
-              </w:numPr>
-              <w:jc w:val="center"/>
-              <w:rPr>
-                <w:lang w:val="en-CA"/>
-              </w:rPr>
-            </w:pPr>
             <m:oMathPara>
               <m:oMath>
                 <m:r>
                   <w:rPr>
                     <w:rFonts w:ascii="Cambria Math" w:hAnsi="Cambria Math" w:hint="eastAsia"/>
-                    <w:color w:val="EE0000"/>
                     <w:lang w:val="en-CA"/>
                   </w:rPr>
-                  <m:t>14</m:t>
+                  <m:t>10</m:t>
                 </m:r>
                 <m:r>
                   <w:rPr>
@@ -3999,7 +4052,7 @@
                     <w:rFonts w:ascii="Cambria Math" w:hAnsi="Cambria Math" w:hint="eastAsia"/>
                     <w:lang w:val="en-CA"/>
                   </w:rPr>
-                  <m:t>40</m:t>
+                  <m:t>50</m:t>
                 </m:r>
               </m:oMath>
             </m:oMathPara>
@@ -4007,7 +4060,10 @@
         </w:tc>
         <w:tc>
           <w:tcPr>
-            <w:tcW w:w="709" w:type="dxa"/>
+            <w:tcW w:w="708" w:type="dxa"/>
+            <w:tcBorders>
+              <w:top w:val="single" w:sz="4" w:space="0" w:color="auto"/>
+            </w:tcBorders>
             <w:vAlign w:val="center"/>
           </w:tcPr>
           <w:p>
@@ -4030,9 +4086,19 @@
             </w:r>
           </w:p>
         </w:tc>
-        <w:tc>
-          <w:tcPr>
-            <w:tcW w:w="236" w:type="dxa"/>
+      </w:tr>
+      <w:tr>
+        <w:trPr>
+          <w:jc w:val="center"/>
+        </w:trPr>
+        <w:tc>
+          <w:tcPr>
+            <w:tcW w:w="1276" w:type="dxa"/>
+            <w:vMerge/>
+            <w:tcBorders>
+              <w:bottom w:val="single" w:sz="4" w:space="0" w:color="auto"/>
+            </w:tcBorders>
+            <w:vAlign w:val="center"/>
           </w:tcPr>
           <w:p>
             <w:pPr>
@@ -4050,8 +4116,7 @@
         </w:tc>
         <w:tc>
           <w:tcPr>
-            <w:tcW w:w="1039" w:type="dxa"/>
-            <w:vMerge/>
+            <w:tcW w:w="992" w:type="dxa"/>
             <w:vAlign w:val="center"/>
           </w:tcPr>
           <w:p>
@@ -4066,11 +4131,103 @@
                 <w:lang w:val="en-CA"/>
               </w:rPr>
             </w:pPr>
-          </w:p>
-        </w:tc>
-        <w:tc>
-          <w:tcPr>
-            <w:tcW w:w="851" w:type="dxa"/>
+            <w:r>
+              <w:rPr>
+                <w:rFonts w:hint="eastAsia"/>
+                <w:lang w:val="en-CA"/>
+              </w:rPr>
+              <w:t>寬</w:t>
+            </w:r>
+          </w:p>
+        </w:tc>
+        <w:tc>
+          <w:tcPr>
+            <w:tcW w:w="1276" w:type="dxa"/>
+            <w:vAlign w:val="center"/>
+          </w:tcPr>
+          <w:p>
+            <w:pPr>
+              <w:pStyle w:val="a"/>
+              <w:numPr>
+                <w:ilvl w:val="0"/>
+                <w:numId w:val="0"/>
+              </w:numPr>
+              <w:jc w:val="center"/>
+              <w:rPr>
+                <w:lang w:val="en-CA"/>
+              </w:rPr>
+            </w:pPr>
+          </w:p>
+        </w:tc>
+        <w:tc>
+          <w:tcPr>
+            <w:tcW w:w="709" w:type="dxa"/>
+            <w:vAlign w:val="center"/>
+          </w:tcPr>
+          <w:p>
+            <w:pPr>
+              <w:pStyle w:val="a"/>
+              <w:numPr>
+                <w:ilvl w:val="0"/>
+                <w:numId w:val="0"/>
+              </w:numPr>
+              <w:jc w:val="center"/>
+              <w:rPr>
+                <w:lang w:val="en-CA"/>
+              </w:rPr>
+            </w:pPr>
+            <w:r>
+              <w:rPr>
+                <w:lang w:val="en-CA"/>
+              </w:rPr>
+              <w:t>mm</w:t>
+            </w:r>
+          </w:p>
+        </w:tc>
+        <w:tc>
+          <w:tcPr>
+            <w:tcW w:w="236" w:type="dxa"/>
+          </w:tcPr>
+          <w:p>
+            <w:pPr>
+              <w:pStyle w:val="a"/>
+              <w:numPr>
+                <w:ilvl w:val="0"/>
+                <w:numId w:val="0"/>
+              </w:numPr>
+              <w:jc w:val="center"/>
+              <w:rPr>
+                <w:lang w:val="en-CA"/>
+              </w:rPr>
+            </w:pPr>
+          </w:p>
+        </w:tc>
+        <w:tc>
+          <w:tcPr>
+            <w:tcW w:w="1039" w:type="dxa"/>
+            <w:vMerge/>
+            <w:tcBorders>
+              <w:bottom w:val="single" w:sz="4" w:space="0" w:color="auto"/>
+            </w:tcBorders>
+            <w:vAlign w:val="center"/>
+          </w:tcPr>
+          <w:p>
+            <w:pPr>
+              <w:pStyle w:val="a"/>
+              <w:numPr>
+                <w:ilvl w:val="0"/>
+                <w:numId w:val="0"/>
+              </w:numPr>
+              <w:jc w:val="center"/>
+              <w:rPr>
+                <w:lang w:val="en-CA"/>
+              </w:rPr>
+            </w:pPr>
+          </w:p>
+        </w:tc>
+        <w:tc>
+          <w:tcPr>
+            <w:tcW w:w="993" w:type="dxa"/>
             <w:vAlign w:val="center"/>
           </w:tcPr>
           <w:p>
@@ -4121,7 +4278,27 @@
                     <w:sz w:val="22"/>
                     <w:szCs w:val="22"/>
                   </w:rPr>
-                  <m:t>150-300</m:t>
+                  <m:t>1</m:t>
+                </m:r>
+                <m:r>
+                  <w:rPr>
+                    <w:rFonts w:ascii="Cambria Math" w:hAnsi="Cambria Math" w:cs="Arial" w:hint="eastAsia"/>
+                    <w:color w:val="131314"/>
+                    <w:kern w:val="24"/>
+                    <w:sz w:val="22"/>
+                    <w:szCs w:val="22"/>
+                  </w:rPr>
+                  <m:t>0</m:t>
+                </m:r>
+                <m:r>
+                  <w:rPr>
+                    <w:rFonts w:ascii="Cambria Math" w:hAnsi="Cambria Math" w:cs="Arial"/>
+                    <w:color w:val="131314"/>
+                    <w:kern w:val="24"/>
+                    <w:sz w:val="22"/>
+                    <w:szCs w:val="22"/>
+                  </w:rPr>
+                  <m:t>-300</m:t>
                 </m:r>
               </m:oMath>
             </m:oMathPara>
@@ -4129,7 +4306,7 @@
         </w:tc>
         <w:tc>
           <w:tcPr>
-            <w:tcW w:w="709" w:type="dxa"/>
+            <w:tcW w:w="708" w:type="dxa"/>
             <w:vAlign w:val="center"/>
           </w:tcPr>
           <w:p>
@@ -4162,6 +4339,9 @@
           <w:tcPr>
             <w:tcW w:w="1276" w:type="dxa"/>
             <w:vMerge/>
+            <w:tcBorders>
+              <w:bottom w:val="single" w:sz="4" w:space="0" w:color="auto"/>
+            </w:tcBorders>
             <w:vAlign w:val="center"/>
           </w:tcPr>
           <w:p>
@@ -4180,7 +4360,7 @@
         </w:tc>
         <w:tc>
           <w:tcPr>
-            <w:tcW w:w="850" w:type="dxa"/>
+            <w:tcW w:w="992" w:type="dxa"/>
             <w:vAlign w:val="center"/>
           </w:tcPr>
           <w:p>
@@ -4206,7 +4386,7 @@
         </w:tc>
         <w:tc>
           <w:tcPr>
-            <w:tcW w:w="1418" w:type="dxa"/>
+            <w:tcW w:w="1276" w:type="dxa"/>
             <w:vAlign w:val="center"/>
           </w:tcPr>
           <w:p>
@@ -4218,7 +4398,7 @@
               </w:numPr>
               <w:jc w:val="center"/>
               <w:rPr>
-                <w:lang w:val="en-CA"/>
+                <w:rFonts w:cs="Times New Roman"/>
               </w:rPr>
             </w:pPr>
             <m:oMathPara>
@@ -4227,7 +4407,7 @@
                   <w:rPr>
                     <w:rFonts w:ascii="Cambria Math" w:hAnsi="Cambria Math"/>
                   </w:rPr>
-                  <m:t>0.5-5</m:t>
+                  <m:t>1-9</m:t>
                 </m:r>
               </m:oMath>
             </m:oMathPara>
@@ -4280,6 +4460,9 @@
           <w:tcPr>
             <w:tcW w:w="1039" w:type="dxa"/>
             <w:vMerge/>
+            <w:tcBorders>
+              <w:bottom w:val="single" w:sz="4" w:space="0" w:color="auto"/>
+            </w:tcBorders>
             <w:vAlign w:val="center"/>
           </w:tcPr>
           <w:p>
@@ -4298,7 +4481,7 @@
         </w:tc>
         <w:tc>
           <w:tcPr>
-            <w:tcW w:w="851" w:type="dxa"/>
+            <w:tcW w:w="993" w:type="dxa"/>
             <w:vAlign w:val="center"/>
           </w:tcPr>
           <w:p>
@@ -4343,7 +4526,7 @@
         </w:tc>
         <w:tc>
           <w:tcPr>
-            <w:tcW w:w="709" w:type="dxa"/>
+            <w:tcW w:w="708" w:type="dxa"/>
             <w:vAlign w:val="center"/>
           </w:tcPr>
           <w:p>
@@ -4375,6 +4558,9 @@
           <w:tcPr>
             <w:tcW w:w="1276" w:type="dxa"/>
             <w:vMerge/>
+            <w:tcBorders>
+              <w:bottom w:val="single" w:sz="4" w:space="0" w:color="auto"/>
+            </w:tcBorders>
             <w:vAlign w:val="center"/>
           </w:tcPr>
           <w:p>
@@ -4393,7 +4579,7 @@
         </w:tc>
         <w:tc>
           <w:tcPr>
-            <w:tcW w:w="850" w:type="dxa"/>
+            <w:tcW w:w="992" w:type="dxa"/>
             <w:vAlign w:val="center"/>
           </w:tcPr>
           <w:p>
@@ -4408,18 +4594,20 @@
                 <w:lang w:val="en-CA"/>
               </w:rPr>
             </w:pPr>
+            <w:proofErr w:type="gramStart"/>
             <w:r>
               <w:rPr>
                 <w:rFonts w:hint="eastAsia"/>
                 <w:lang w:val="en-CA"/>
               </w:rPr>
-              <w:t>材質</w:t>
-            </w:r>
-          </w:p>
-        </w:tc>
-        <w:tc>
-          <w:tcPr>
-            <w:tcW w:w="1418" w:type="dxa"/>
+              <w:t>極數</w:t>
+            </w:r>
+            <w:proofErr w:type="gramEnd"/>
+          </w:p>
+        </w:tc>
+        <w:tc>
+          <w:tcPr>
+            <w:tcW w:w="1276" w:type="dxa"/>
             <w:vAlign w:val="center"/>
           </w:tcPr>
           <w:p>
@@ -4431,15 +4619,34 @@
               </w:numPr>
               <w:jc w:val="center"/>
               <w:rPr>
-                <w:rFonts w:cs="Times New Roman"/>
-              </w:rPr>
-            </w:pPr>
-            <w:r>
-              <w:rPr>
-                <w:rFonts w:hint="eastAsia"/>
-              </w:rPr>
-              <w:t>1060-Al</w:t>
-            </w:r>
+                <w:lang w:val="en-CA"/>
+              </w:rPr>
+            </w:pPr>
+            <m:oMathPara>
+              <m:oMath>
+                <m:r>
+                  <w:rPr>
+                    <w:rFonts w:ascii="Cambria Math" w:hAnsi="Cambria Math" w:hint="eastAsia"/>
+                    <w:lang w:val="en-CA"/>
+                  </w:rPr>
+                  <m:t>3</m:t>
+                </m:r>
+                <m:r>
+                  <w:rPr>
+                    <w:rFonts w:ascii="Cambria Math" w:hAnsi="Cambria Math" w:cs="Cambria Math"/>
+                    <w:lang w:val="en-CA"/>
+                  </w:rPr>
+                  <m:t>-</m:t>
+                </m:r>
+                <m:r>
+                  <w:rPr>
+                    <w:rFonts w:ascii="Cambria Math" w:hAnsi="Cambria Math" w:hint="eastAsia"/>
+                    <w:lang w:val="en-CA"/>
+                  </w:rPr>
+                  <m:t>10</m:t>
+                </m:r>
+              </m:oMath>
+            </m:oMathPara>
           </w:p>
         </w:tc>
         <w:tc>
@@ -4490,6 +4697,9 @@
           <w:tcPr>
             <w:tcW w:w="1039" w:type="dxa"/>
             <w:vMerge/>
+            <w:tcBorders>
+              <w:bottom w:val="single" w:sz="4" w:space="0" w:color="auto"/>
+            </w:tcBorders>
             <w:vAlign w:val="center"/>
           </w:tcPr>
           <w:p>
@@ -4508,7 +4718,7 @@
         </w:tc>
         <w:tc>
           <w:tcPr>
-            <w:tcW w:w="851" w:type="dxa"/>
+            <w:tcW w:w="993" w:type="dxa"/>
             <w:vAlign w:val="center"/>
           </w:tcPr>
           <w:p>
@@ -4551,13 +4761,21 @@
             </w:pPr>
             <m:oMathPara>
               <m:oMath>
+                <m:r>
+                  <w:rPr>
+                    <w:rFonts w:ascii="Cambria Math" w:hAnsi="Cambria Math" w:cs="Arial" w:hint="eastAsia"/>
+                    <w:color w:val="000000" w:themeColor="text1"/>
+                    <w:kern w:val="24"/>
+                  </w:rPr>
+                  <m:t>3</m:t>
+                </m:r>
                 <m:r>
                   <w:rPr>
                     <w:rFonts w:ascii="Cambria Math" w:hAnsi="Cambria Math" w:cs="Arial"/>
                     <w:color w:val="000000" w:themeColor="text1"/>
                     <w:kern w:val="24"/>
                   </w:rPr>
-                  <m:t>4-12</m:t>
+                  <m:t>-12</m:t>
                 </m:r>
               </m:oMath>
             </m:oMathPara>
@@ -4565,7 +4783,7 @@
         </w:tc>
         <w:tc>
           <w:tcPr>
-            <w:tcW w:w="709" w:type="dxa"/>
+            <w:tcW w:w="708" w:type="dxa"/>
             <w:vAlign w:val="center"/>
           </w:tcPr>
           <w:p>
@@ -4599,7 +4817,7 @@
             <w:tcW w:w="1276" w:type="dxa"/>
             <w:vMerge/>
             <w:tcBorders>
-              <w:bottom w:val="single" w:sz="4" w:space="0" w:color="000000"/>
+              <w:bottom w:val="single" w:sz="4" w:space="0" w:color="auto"/>
             </w:tcBorders>
             <w:vAlign w:val="center"/>
           </w:tcPr>
@@ -4619,7 +4837,7 @@
         </w:tc>
         <w:tc>
           <w:tcPr>
-            <w:tcW w:w="850" w:type="dxa"/>
+            <w:tcW w:w="992" w:type="dxa"/>
             <w:tcBorders>
               <w:bottom w:val="single" w:sz="4" w:space="0" w:color="000000"/>
             </w:tcBorders>
@@ -4637,11 +4855,18 @@
                 <w:lang w:val="en-CA"/>
               </w:rPr>
             </w:pPr>
-          </w:p>
-        </w:tc>
-        <w:tc>
-          <w:tcPr>
-            <w:tcW w:w="1418" w:type="dxa"/>
+            <w:r>
+              <w:rPr>
+                <w:rFonts w:hint="eastAsia"/>
+                <w:lang w:val="en-CA"/>
+              </w:rPr>
+              <w:t>材質</w:t>
+            </w:r>
+          </w:p>
+        </w:tc>
+        <w:tc>
+          <w:tcPr>
+            <w:tcW w:w="1276" w:type="dxa"/>
             <w:tcBorders>
               <w:bottom w:val="single" w:sz="4" w:space="0" w:color="000000"/>
             </w:tcBorders>
@@ -4659,6 +4884,12 @@
                 <w:lang w:val="en-CA"/>
               </w:rPr>
             </w:pPr>
+            <w:r>
+              <w:rPr>
+                <w:rFonts w:hint="eastAsia"/>
+              </w:rPr>
+              <w:t>FeNdB-40</w:t>
+            </w:r>
           </w:p>
         </w:tc>
         <w:tc>
@@ -4681,6 +4912,13 @@
                 <w:lang w:val="en-CA"/>
               </w:rPr>
             </w:pPr>
+            <w:r>
+              <w:rPr>
+                <w:rFonts w:hint="eastAsia"/>
+                <w:lang w:val="en-CA"/>
+              </w:rPr>
+              <w:t>-</w:t>
+            </w:r>
           </w:p>
         </w:tc>
         <w:tc>
@@ -4706,7 +4944,7 @@
             <w:tcW w:w="1039" w:type="dxa"/>
             <w:vMerge/>
             <w:tcBorders>
-              <w:bottom w:val="single" w:sz="4" w:space="0" w:color="000000"/>
+              <w:bottom w:val="single" w:sz="4" w:space="0" w:color="auto"/>
             </w:tcBorders>
             <w:vAlign w:val="center"/>
           </w:tcPr>
@@ -4726,9 +4964,9 @@
         </w:tc>
         <w:tc>
           <w:tcPr>
-            <w:tcW w:w="851" w:type="dxa"/>
+            <w:tcW w:w="993" w:type="dxa"/>
             <w:tcBorders>
-              <w:bottom w:val="single" w:sz="4" w:space="0" w:color="000000"/>
+              <w:bottom w:val="single" w:sz="4" w:space="0" w:color="auto"/>
             </w:tcBorders>
             <w:vAlign w:val="center"/>
           </w:tcPr>
@@ -4757,7 +4995,7 @@
           <w:tcPr>
             <w:tcW w:w="1276" w:type="dxa"/>
             <w:tcBorders>
-              <w:bottom w:val="single" w:sz="4" w:space="0" w:color="000000"/>
+              <w:bottom w:val="single" w:sz="4" w:space="0" w:color="auto"/>
             </w:tcBorders>
             <w:vAlign w:val="center"/>
           </w:tcPr>
@@ -4773,219 +5011,20 @@
                 <w:lang w:val="en-CA"/>
               </w:rPr>
             </w:pPr>
-          </w:p>
-        </w:tc>
-        <w:tc>
-          <w:tcPr>
-            <w:tcW w:w="709" w:type="dxa"/>
+            <w:r>
+              <w:rPr>
+                <w:rFonts w:hint="eastAsia"/>
+                <w:lang w:val="en-CA"/>
+              </w:rPr>
+              <w:t>-</w:t>
+            </w:r>
+          </w:p>
+        </w:tc>
+        <w:tc>
+          <w:tcPr>
+            <w:tcW w:w="708" w:type="dxa"/>
             <w:tcBorders>
-              <w:bottom w:val="single" w:sz="4" w:space="0" w:color="000000"/>
-            </w:tcBorders>
-            <w:vAlign w:val="center"/>
-          </w:tcPr>
-          <w:p>
-            <w:pPr>
-              <w:pStyle w:val="a"/>
-              <w:numPr>
-                <w:ilvl w:val="0"/>
-                <w:numId w:val="0"/>
-              </w:numPr>
-              <w:jc w:val="center"/>
-              <w:rPr>
-                <w:lang w:val="en-CA"/>
-              </w:rPr>
-            </w:pPr>
-            <w:r>
-              <w:rPr>
-                <w:rFonts w:hint="eastAsia"/>
-                <w:lang w:val="en-CA"/>
-              </w:rPr>
-              <w:t>-</w:t>
-            </w:r>
-          </w:p>
-        </w:tc>
-      </w:tr>
-      <w:tr>
-        <w:trPr>
-          <w:jc w:val="center"/>
-        </w:trPr>
-        <w:tc>
-          <w:tcPr>
-            <w:tcW w:w="1276" w:type="dxa"/>
-            <w:tcBorders>
-              <w:top w:val="single" w:sz="4" w:space="0" w:color="000000"/>
-            </w:tcBorders>
-            <w:vAlign w:val="center"/>
-          </w:tcPr>
-          <w:p>
-            <w:pPr>
-              <w:pStyle w:val="a"/>
-              <w:numPr>
-                <w:ilvl w:val="0"/>
-                <w:numId w:val="0"/>
-              </w:numPr>
-              <w:jc w:val="center"/>
-              <w:rPr>
-                <w:lang w:val="en-CA"/>
-              </w:rPr>
-            </w:pPr>
-          </w:p>
-        </w:tc>
-        <w:tc>
-          <w:tcPr>
-            <w:tcW w:w="850" w:type="dxa"/>
-            <w:tcBorders>
-              <w:top w:val="single" w:sz="4" w:space="0" w:color="000000"/>
-            </w:tcBorders>
-            <w:vAlign w:val="center"/>
-          </w:tcPr>
-          <w:p>
-            <w:pPr>
-              <w:pStyle w:val="a"/>
-              <w:numPr>
-                <w:ilvl w:val="0"/>
-                <w:numId w:val="0"/>
-              </w:numPr>
-              <w:jc w:val="center"/>
-              <w:rPr>
-                <w:lang w:val="en-CA"/>
-              </w:rPr>
-            </w:pPr>
-          </w:p>
-        </w:tc>
-        <w:tc>
-          <w:tcPr>
-            <w:tcW w:w="1418" w:type="dxa"/>
-            <w:tcBorders>
-              <w:top w:val="single" w:sz="4" w:space="0" w:color="000000"/>
-            </w:tcBorders>
-            <w:vAlign w:val="center"/>
-          </w:tcPr>
-          <w:p>
-            <w:pPr>
-              <w:pStyle w:val="a"/>
-              <w:numPr>
-                <w:ilvl w:val="0"/>
-                <w:numId w:val="0"/>
-              </w:numPr>
-              <w:jc w:val="center"/>
-              <w:rPr>
-                <w:lang w:val="en-CA"/>
-              </w:rPr>
-            </w:pPr>
-          </w:p>
-        </w:tc>
-        <w:tc>
-          <w:tcPr>
-            <w:tcW w:w="709" w:type="dxa"/>
-            <w:tcBorders>
-              <w:top w:val="single" w:sz="4" w:space="0" w:color="000000"/>
-            </w:tcBorders>
-            <w:vAlign w:val="center"/>
-          </w:tcPr>
-          <w:p>
-            <w:pPr>
-              <w:pStyle w:val="a"/>
-              <w:numPr>
-                <w:ilvl w:val="0"/>
-                <w:numId w:val="0"/>
-              </w:numPr>
-              <w:jc w:val="center"/>
-              <w:rPr>
-                <w:lang w:val="en-CA"/>
-              </w:rPr>
-            </w:pPr>
-          </w:p>
-        </w:tc>
-        <w:tc>
-          <w:tcPr>
-            <w:tcW w:w="236" w:type="dxa"/>
-          </w:tcPr>
-          <w:p>
-            <w:pPr>
-              <w:pStyle w:val="a"/>
-              <w:numPr>
-                <w:ilvl w:val="0"/>
-                <w:numId w:val="0"/>
-              </w:numPr>
-              <w:jc w:val="center"/>
-              <w:rPr>
-                <w:lang w:val="en-CA"/>
-              </w:rPr>
-            </w:pPr>
-          </w:p>
-        </w:tc>
-        <w:tc>
-          <w:tcPr>
-            <w:tcW w:w="1039" w:type="dxa"/>
-            <w:tcBorders>
-              <w:top w:val="single" w:sz="4" w:space="0" w:color="000000"/>
-            </w:tcBorders>
-            <w:vAlign w:val="center"/>
-          </w:tcPr>
-          <w:p>
-            <w:pPr>
-              <w:pStyle w:val="a"/>
-              <w:numPr>
-                <w:ilvl w:val="0"/>
-                <w:numId w:val="0"/>
-              </w:numPr>
-              <w:jc w:val="center"/>
-              <w:rPr>
-                <w:lang w:val="en-CA"/>
-              </w:rPr>
-            </w:pPr>
-          </w:p>
-        </w:tc>
-        <w:tc>
-          <w:tcPr>
-            <w:tcW w:w="851" w:type="dxa"/>
-            <w:tcBorders>
-              <w:top w:val="single" w:sz="4" w:space="0" w:color="000000"/>
-            </w:tcBorders>
-            <w:vAlign w:val="center"/>
-          </w:tcPr>
-          <w:p>
-            <w:pPr>
-              <w:pStyle w:val="a"/>
-              <w:numPr>
-                <w:ilvl w:val="0"/>
-                <w:numId w:val="0"/>
-              </w:numPr>
-              <w:jc w:val="center"/>
-              <w:rPr>
-                <w:lang w:val="en-CA"/>
-              </w:rPr>
-            </w:pPr>
-          </w:p>
-        </w:tc>
-        <w:tc>
-          <w:tcPr>
-            <w:tcW w:w="1276" w:type="dxa"/>
-            <w:tcBorders>
-              <w:top w:val="single" w:sz="4" w:space="0" w:color="000000"/>
-            </w:tcBorders>
-            <w:vAlign w:val="center"/>
-          </w:tcPr>
-          <w:p>
-            <w:pPr>
-              <w:pStyle w:val="a"/>
-              <w:numPr>
-                <w:ilvl w:val="0"/>
-                <w:numId w:val="0"/>
-              </w:numPr>
-              <w:jc w:val="center"/>
-              <w:rPr>
-                <w:lang w:val="en-CA"/>
-              </w:rPr>
-            </w:pPr>
-          </w:p>
-        </w:tc>
-        <w:tc>
-          <w:tcPr>
-            <w:tcW w:w="709" w:type="dxa"/>
-            <w:tcBorders>
-              <w:top w:val="single" w:sz="4" w:space="0" w:color="000000"/>
+              <w:bottom w:val="single" w:sz="4" w:space="0" w:color="auto"/>
             </w:tcBorders>
             <w:vAlign w:val="center"/>
           </w:tcPr>
@@ -4999,6 +5038,948 @@
               </w:numPr>
               <w:jc w:val="center"/>
               <w:rPr>
+                <w:lang w:val="en-CA"/>
+              </w:rPr>
+            </w:pPr>
+            <w:r>
+              <w:rPr>
+                <w:rFonts w:hint="eastAsia"/>
+                <w:lang w:val="en-CA"/>
+              </w:rPr>
+              <w:t>-</w:t>
+            </w:r>
+          </w:p>
+        </w:tc>
+      </w:tr>
+      <w:tr>
+        <w:trPr>
+          <w:jc w:val="center"/>
+        </w:trPr>
+        <w:tc>
+          <w:tcPr>
+            <w:tcW w:w="1276" w:type="dxa"/>
+            <w:vMerge w:val="restart"/>
+            <w:tcBorders>
+              <w:top w:val="single" w:sz="4" w:space="0" w:color="auto"/>
+            </w:tcBorders>
+            <w:vAlign w:val="center"/>
+          </w:tcPr>
+          <w:p>
+            <w:pPr>
+              <w:pStyle w:val="a"/>
+              <w:numPr>
+                <w:ilvl w:val="0"/>
+                <w:numId w:val="0"/>
+              </w:numPr>
+              <w:jc w:val="center"/>
+              <w:rPr>
+                <w:lang w:val="en-CA"/>
+              </w:rPr>
+            </w:pPr>
+            <w:proofErr w:type="gramStart"/>
+            <w:r>
+              <w:rPr>
+                <w:rFonts w:hint="eastAsia"/>
+                <w:lang w:val="en-CA"/>
+              </w:rPr>
+              <w:t>楔形面</w:t>
+            </w:r>
+            <w:proofErr w:type="gramEnd"/>
+          </w:p>
+        </w:tc>
+        <w:tc>
+          <w:tcPr>
+            <w:tcW w:w="992" w:type="dxa"/>
+            <w:tcBorders>
+              <w:top w:val="single" w:sz="4" w:space="0" w:color="000000"/>
+            </w:tcBorders>
+            <w:vAlign w:val="center"/>
+          </w:tcPr>
+          <w:p>
+            <w:pPr>
+              <w:pStyle w:val="a"/>
+              <w:numPr>
+                <w:ilvl w:val="0"/>
+                <w:numId w:val="0"/>
+              </w:numPr>
+              <w:jc w:val="center"/>
+              <w:rPr>
+                <w:rFonts w:hint="eastAsia"/>
+                <w:lang w:val="en-CA"/>
+              </w:rPr>
+            </w:pPr>
+            <w:r>
+              <w:rPr>
+                <w:rFonts w:hint="eastAsia"/>
+                <w:lang w:val="en-CA"/>
+              </w:rPr>
+              <w:t>傾角</w:t>
+            </w:r>
+          </w:p>
+        </w:tc>
+        <w:tc>
+          <w:tcPr>
+            <w:tcW w:w="1276" w:type="dxa"/>
+            <w:tcBorders>
+              <w:top w:val="single" w:sz="4" w:space="0" w:color="000000"/>
+            </w:tcBorders>
+            <w:vAlign w:val="center"/>
+          </w:tcPr>
+          <w:p>
+            <w:pPr>
+              <w:pStyle w:val="a"/>
+              <w:numPr>
+                <w:ilvl w:val="0"/>
+                <w:numId w:val="0"/>
+              </w:numPr>
+              <w:jc w:val="center"/>
+              <w:rPr>
+                <w:rFonts w:hint="eastAsia"/>
+              </w:rPr>
+            </w:pPr>
+            <m:oMathPara>
+              <m:oMath>
+                <m:r>
+                  <w:rPr>
+                    <w:rFonts w:ascii="Cambria Math" w:hAnsi="Cambria Math" w:hint="eastAsia"/>
+                  </w:rPr>
+                  <m:t>15</m:t>
+                </m:r>
+                <m:r>
+                  <w:rPr>
+                    <w:rFonts w:ascii="Cambria Math" w:hAnsi="Cambria Math" w:cs="Cambria Math"/>
+                  </w:rPr>
+                  <m:t>-</m:t>
+                </m:r>
+                <m:r>
+                  <w:rPr>
+                    <w:rFonts w:ascii="Cambria Math" w:hAnsi="Cambria Math" w:hint="eastAsia"/>
+                  </w:rPr>
+                  <m:t>75</m:t>
+                </m:r>
+              </m:oMath>
+            </m:oMathPara>
+          </w:p>
+        </w:tc>
+        <w:tc>
+          <w:tcPr>
+            <w:tcW w:w="709" w:type="dxa"/>
+            <w:tcBorders>
+              <w:top w:val="single" w:sz="4" w:space="0" w:color="000000"/>
+            </w:tcBorders>
+            <w:vAlign w:val="center"/>
+          </w:tcPr>
+          <w:p>
+            <w:pPr>
+              <w:pStyle w:val="a"/>
+              <w:numPr>
+                <w:ilvl w:val="0"/>
+                <w:numId w:val="0"/>
+              </w:numPr>
+              <w:jc w:val="center"/>
+              <w:rPr>
+                <w:rFonts w:hint="eastAsia"/>
+                <w:lang w:val="en-CA"/>
+              </w:rPr>
+            </w:pPr>
+            <m:oMathPara>
+              <m:oMath>
+                <m:r>
+                  <w:rPr>
+                    <w:rFonts w:ascii="Cambria Math" w:hAnsi="Cambria Math"/>
+                  </w:rPr>
+                  <m:t>°</m:t>
+                </m:r>
+              </m:oMath>
+            </m:oMathPara>
+          </w:p>
+        </w:tc>
+        <w:tc>
+          <w:tcPr>
+            <w:tcW w:w="236" w:type="dxa"/>
+          </w:tcPr>
+          <w:p>
+            <w:pPr>
+              <w:pStyle w:val="a"/>
+              <w:numPr>
+                <w:ilvl w:val="0"/>
+                <w:numId w:val="0"/>
+              </w:numPr>
+              <w:jc w:val="center"/>
+              <w:rPr>
+                <w:lang w:val="en-CA"/>
+              </w:rPr>
+            </w:pPr>
+          </w:p>
+        </w:tc>
+        <w:tc>
+          <w:tcPr>
+            <w:tcW w:w="1039" w:type="dxa"/>
+            <w:tcBorders>
+              <w:top w:val="single" w:sz="4" w:space="0" w:color="auto"/>
+            </w:tcBorders>
+            <w:vAlign w:val="center"/>
+          </w:tcPr>
+          <w:p>
+            <w:pPr>
+              <w:pStyle w:val="a"/>
+              <w:numPr>
+                <w:ilvl w:val="0"/>
+                <w:numId w:val="0"/>
+              </w:numPr>
+              <w:jc w:val="center"/>
+              <w:rPr>
+                <w:lang w:val="en-CA"/>
+              </w:rPr>
+            </w:pPr>
+          </w:p>
+        </w:tc>
+        <w:tc>
+          <w:tcPr>
+            <w:tcW w:w="993" w:type="dxa"/>
+            <w:tcBorders>
+              <w:top w:val="single" w:sz="4" w:space="0" w:color="auto"/>
+            </w:tcBorders>
+            <w:vAlign w:val="center"/>
+          </w:tcPr>
+          <w:p>
+            <w:pPr>
+              <w:pStyle w:val="a"/>
+              <w:numPr>
+                <w:ilvl w:val="0"/>
+                <w:numId w:val="0"/>
+              </w:numPr>
+              <w:jc w:val="center"/>
+              <w:rPr>
+                <w:rFonts w:hint="eastAsia"/>
+                <w:lang w:val="en-CA"/>
+              </w:rPr>
+            </w:pPr>
+          </w:p>
+        </w:tc>
+        <w:tc>
+          <w:tcPr>
+            <w:tcW w:w="1276" w:type="dxa"/>
+            <w:tcBorders>
+              <w:top w:val="single" w:sz="4" w:space="0" w:color="auto"/>
+            </w:tcBorders>
+            <w:vAlign w:val="center"/>
+          </w:tcPr>
+          <w:p>
+            <w:pPr>
+              <w:pStyle w:val="a"/>
+              <w:numPr>
+                <w:ilvl w:val="0"/>
+                <w:numId w:val="0"/>
+              </w:numPr>
+              <w:jc w:val="center"/>
+              <w:rPr>
+                <w:rFonts w:hint="eastAsia"/>
+                <w:lang w:val="en-CA"/>
+              </w:rPr>
+            </w:pPr>
+          </w:p>
+        </w:tc>
+        <w:tc>
+          <w:tcPr>
+            <w:tcW w:w="708" w:type="dxa"/>
+            <w:tcBorders>
+              <w:top w:val="single" w:sz="4" w:space="0" w:color="auto"/>
+            </w:tcBorders>
+            <w:vAlign w:val="center"/>
+          </w:tcPr>
+          <w:p>
+            <w:pPr>
+              <w:pStyle w:val="a"/>
+              <w:keepNext/>
+              <w:numPr>
+                <w:ilvl w:val="0"/>
+                <w:numId w:val="0"/>
+              </w:numPr>
+              <w:jc w:val="center"/>
+              <w:rPr>
+                <w:rFonts w:hint="eastAsia"/>
+                <w:lang w:val="en-CA"/>
+              </w:rPr>
+            </w:pPr>
+          </w:p>
+        </w:tc>
+      </w:tr>
+      <w:tr>
+        <w:trPr>
+          <w:jc w:val="center"/>
+        </w:trPr>
+        <w:tc>
+          <w:tcPr>
+            <w:tcW w:w="1276" w:type="dxa"/>
+            <w:vMerge/>
+            <w:vAlign w:val="center"/>
+          </w:tcPr>
+          <w:p>
+            <w:pPr>
+              <w:pStyle w:val="a"/>
+              <w:numPr>
+                <w:ilvl w:val="0"/>
+                <w:numId w:val="0"/>
+              </w:numPr>
+              <w:jc w:val="center"/>
+              <w:rPr>
+                <w:rFonts w:hint="eastAsia"/>
+                <w:lang w:val="en-CA"/>
+              </w:rPr>
+            </w:pPr>
+          </w:p>
+        </w:tc>
+        <w:tc>
+          <w:tcPr>
+            <w:tcW w:w="992" w:type="dxa"/>
+            <w:vAlign w:val="center"/>
+          </w:tcPr>
+          <w:p>
+            <w:pPr>
+              <w:pStyle w:val="a"/>
+              <w:numPr>
+                <w:ilvl w:val="0"/>
+                <w:numId w:val="0"/>
+              </w:numPr>
+              <w:jc w:val="center"/>
+              <w:rPr>
+                <w:rFonts w:hint="eastAsia"/>
+                <w:lang w:val="en-CA"/>
+              </w:rPr>
+            </w:pPr>
+            <m:oMathPara>
+              <m:oMath>
+                <m:sSub>
+                  <m:sSubPr>
+                    <m:ctrlPr>
+                      <w:rPr>
+                        <w:rFonts w:ascii="Cambria Math" w:hAnsi="Cambria Math"/>
+                        <w:i/>
+                        <w:lang w:val="en-CA"/>
+                      </w:rPr>
+                    </m:ctrlPr>
+                  </m:sSubPr>
+                  <m:e>
+                    <m:r>
+                      <w:rPr>
+                        <w:rFonts w:ascii="Cambria Math" w:hAnsi="Cambria Math"/>
+                        <w:lang w:val="en-CA"/>
+                      </w:rPr>
+                      <m:t>μ</m:t>
+                    </m:r>
+                  </m:e>
+                  <m:sub>
+                    <m:r>
+                      <w:rPr>
+                        <w:rFonts w:ascii="Cambria Math" w:hAnsi="Cambria Math"/>
+                        <w:lang w:val="en-CA"/>
+                      </w:rPr>
+                      <m:t>wedge</m:t>
+                    </m:r>
+                  </m:sub>
+                </m:sSub>
+              </m:oMath>
+            </m:oMathPara>
+          </w:p>
+        </w:tc>
+        <w:tc>
+          <w:tcPr>
+            <w:tcW w:w="1276" w:type="dxa"/>
+            <w:vAlign w:val="center"/>
+          </w:tcPr>
+          <w:p>
+            <w:pPr>
+              <w:pStyle w:val="a"/>
+              <w:numPr>
+                <w:ilvl w:val="0"/>
+                <w:numId w:val="0"/>
+              </w:numPr>
+              <w:jc w:val="center"/>
+              <w:rPr>
+                <w:rFonts w:cs="Times New Roman" w:hint="eastAsia"/>
+              </w:rPr>
+            </w:pPr>
+            <m:oMathPara>
+              <m:oMath>
+                <m:r>
+                  <w:rPr>
+                    <w:rFonts w:ascii="Cambria Math" w:hAnsi="Cambria Math" w:cs="Times New Roman"/>
+                  </w:rPr>
+                  <m:t>0.1-0.2</m:t>
+                </m:r>
+              </m:oMath>
+            </m:oMathPara>
+          </w:p>
+        </w:tc>
+        <w:tc>
+          <w:tcPr>
+            <w:tcW w:w="709" w:type="dxa"/>
+            <w:vAlign w:val="center"/>
+          </w:tcPr>
+          <w:p>
+            <w:pPr>
+              <w:pStyle w:val="a"/>
+              <w:numPr>
+                <w:ilvl w:val="0"/>
+                <w:numId w:val="0"/>
+              </w:numPr>
+              <w:jc w:val="center"/>
+              <w:rPr>
+                <w:rFonts w:cs="Times New Roman"/>
+              </w:rPr>
+            </w:pPr>
+            <w:r>
+              <w:rPr>
+                <w:rFonts w:cs="Times New Roman" w:hint="eastAsia"/>
+              </w:rPr>
+              <w:t>-</w:t>
+            </w:r>
+          </w:p>
+        </w:tc>
+        <w:tc>
+          <w:tcPr>
+            <w:tcW w:w="236" w:type="dxa"/>
+          </w:tcPr>
+          <w:p>
+            <w:pPr>
+              <w:pStyle w:val="a"/>
+              <w:numPr>
+                <w:ilvl w:val="0"/>
+                <w:numId w:val="0"/>
+              </w:numPr>
+              <w:jc w:val="center"/>
+              <w:rPr>
+                <w:lang w:val="en-CA"/>
+              </w:rPr>
+            </w:pPr>
+          </w:p>
+        </w:tc>
+        <w:tc>
+          <w:tcPr>
+            <w:tcW w:w="1039" w:type="dxa"/>
+            <w:vAlign w:val="center"/>
+          </w:tcPr>
+          <w:p>
+            <w:pPr>
+              <w:pStyle w:val="a"/>
+              <w:numPr>
+                <w:ilvl w:val="0"/>
+                <w:numId w:val="0"/>
+              </w:numPr>
+              <w:jc w:val="center"/>
+              <w:rPr>
+                <w:lang w:val="en-CA"/>
+              </w:rPr>
+            </w:pPr>
+          </w:p>
+        </w:tc>
+        <w:tc>
+          <w:tcPr>
+            <w:tcW w:w="993" w:type="dxa"/>
+            <w:vAlign w:val="center"/>
+          </w:tcPr>
+          <w:p>
+            <w:pPr>
+              <w:pStyle w:val="a"/>
+              <w:numPr>
+                <w:ilvl w:val="0"/>
+                <w:numId w:val="0"/>
+              </w:numPr>
+              <w:jc w:val="center"/>
+              <w:rPr>
+                <w:rFonts w:hint="eastAsia"/>
+                <w:lang w:val="en-CA"/>
+              </w:rPr>
+            </w:pPr>
+          </w:p>
+        </w:tc>
+        <w:tc>
+          <w:tcPr>
+            <w:tcW w:w="1276" w:type="dxa"/>
+            <w:vAlign w:val="center"/>
+          </w:tcPr>
+          <w:p>
+            <w:pPr>
+              <w:pStyle w:val="a"/>
+              <w:numPr>
+                <w:ilvl w:val="0"/>
+                <w:numId w:val="0"/>
+              </w:numPr>
+              <w:jc w:val="center"/>
+              <w:rPr>
+                <w:rFonts w:hint="eastAsia"/>
+                <w:lang w:val="en-CA"/>
+              </w:rPr>
+            </w:pPr>
+          </w:p>
+        </w:tc>
+        <w:tc>
+          <w:tcPr>
+            <w:tcW w:w="708" w:type="dxa"/>
+            <w:vAlign w:val="center"/>
+          </w:tcPr>
+          <w:p>
+            <w:pPr>
+              <w:pStyle w:val="a"/>
+              <w:keepNext/>
+              <w:numPr>
+                <w:ilvl w:val="0"/>
+                <w:numId w:val="0"/>
+              </w:numPr>
+              <w:jc w:val="center"/>
+              <w:rPr>
+                <w:rFonts w:hint="eastAsia"/>
+                <w:lang w:val="en-CA"/>
+              </w:rPr>
+            </w:pPr>
+          </w:p>
+        </w:tc>
+      </w:tr>
+      <w:tr>
+        <w:trPr>
+          <w:jc w:val="center"/>
+        </w:trPr>
+        <w:tc>
+          <w:tcPr>
+            <w:tcW w:w="1276" w:type="dxa"/>
+            <w:vMerge/>
+            <w:vAlign w:val="center"/>
+          </w:tcPr>
+          <w:p>
+            <w:pPr>
+              <w:pStyle w:val="a"/>
+              <w:numPr>
+                <w:ilvl w:val="0"/>
+                <w:numId w:val="0"/>
+              </w:numPr>
+              <w:jc w:val="center"/>
+              <w:rPr>
+                <w:rFonts w:hint="eastAsia"/>
+                <w:lang w:val="en-CA"/>
+              </w:rPr>
+            </w:pPr>
+          </w:p>
+        </w:tc>
+        <w:tc>
+          <w:tcPr>
+            <w:tcW w:w="992" w:type="dxa"/>
+            <w:vAlign w:val="center"/>
+          </w:tcPr>
+          <w:p>
+            <w:pPr>
+              <w:pStyle w:val="a"/>
+              <w:numPr>
+                <w:ilvl w:val="0"/>
+                <w:numId w:val="0"/>
+              </w:numPr>
+              <w:jc w:val="center"/>
+              <w:rPr>
+                <w:rFonts w:cs="Times New Roman"/>
+                <w:lang w:val="en-CA"/>
+              </w:rPr>
+            </w:pPr>
+            <m:oMathPara>
+              <m:oMath>
+                <m:sSub>
+                  <m:sSubPr>
+                    <m:ctrlPr>
+                      <w:rPr>
+                        <w:rFonts w:ascii="Cambria Math" w:hAnsi="Cambria Math"/>
+                        <w:i/>
+                        <w:lang w:val="en-CA"/>
+                      </w:rPr>
+                    </m:ctrlPr>
+                  </m:sSubPr>
+                  <m:e>
+                    <m:r>
+                      <w:rPr>
+                        <w:rFonts w:ascii="Cambria Math" w:hAnsi="Cambria Math"/>
+                        <w:lang w:val="en-CA"/>
+                      </w:rPr>
+                      <m:t>μ</m:t>
+                    </m:r>
+                  </m:e>
+                  <m:sub>
+                    <m:r>
+                      <w:rPr>
+                        <w:rFonts w:ascii="Cambria Math" w:hAnsi="Cambria Math"/>
+                        <w:lang w:val="en-CA"/>
+                      </w:rPr>
+                      <m:t>t</m:t>
+                    </m:r>
+                  </m:sub>
+                </m:sSub>
+              </m:oMath>
+            </m:oMathPara>
+          </w:p>
+        </w:tc>
+        <w:tc>
+          <w:tcPr>
+            <w:tcW w:w="1276" w:type="dxa"/>
+            <w:vAlign w:val="center"/>
+          </w:tcPr>
+          <w:p>
+            <w:pPr>
+              <w:pStyle w:val="a"/>
+              <w:numPr>
+                <w:ilvl w:val="0"/>
+                <w:numId w:val="0"/>
+              </w:numPr>
+              <w:jc w:val="center"/>
+              <w:rPr>
+                <w:rFonts w:cs="Times New Roman"/>
+              </w:rPr>
+            </w:pPr>
+            <m:oMathPara>
+              <m:oMath>
+                <m:r>
+                  <w:rPr>
+                    <w:rFonts w:ascii="Cambria Math" w:hAnsi="Cambria Math" w:cs="Times New Roman"/>
+                  </w:rPr>
+                  <m:t>0.1-0.6</m:t>
+                </m:r>
+              </m:oMath>
+            </m:oMathPara>
+          </w:p>
+        </w:tc>
+        <w:tc>
+          <w:tcPr>
+            <w:tcW w:w="709" w:type="dxa"/>
+            <w:vAlign w:val="center"/>
+          </w:tcPr>
+          <w:p>
+            <w:pPr>
+              <w:pStyle w:val="a"/>
+              <w:numPr>
+                <w:ilvl w:val="0"/>
+                <w:numId w:val="0"/>
+              </w:numPr>
+              <w:jc w:val="center"/>
+              <w:rPr>
+                <w:rFonts w:cs="Times New Roman" w:hint="eastAsia"/>
+              </w:rPr>
+            </w:pPr>
+            <w:r>
+              <w:rPr>
+                <w:rFonts w:cs="Times New Roman" w:hint="eastAsia"/>
+              </w:rPr>
+              <w:t>-</w:t>
+            </w:r>
+          </w:p>
+        </w:tc>
+        <w:tc>
+          <w:tcPr>
+            <w:tcW w:w="236" w:type="dxa"/>
+          </w:tcPr>
+          <w:p>
+            <w:pPr>
+              <w:pStyle w:val="a"/>
+              <w:numPr>
+                <w:ilvl w:val="0"/>
+                <w:numId w:val="0"/>
+              </w:numPr>
+              <w:jc w:val="center"/>
+              <w:rPr>
+                <w:lang w:val="en-CA"/>
+              </w:rPr>
+            </w:pPr>
+          </w:p>
+        </w:tc>
+        <w:tc>
+          <w:tcPr>
+            <w:tcW w:w="1039" w:type="dxa"/>
+            <w:vAlign w:val="center"/>
+          </w:tcPr>
+          <w:p>
+            <w:pPr>
+              <w:pStyle w:val="a"/>
+              <w:numPr>
+                <w:ilvl w:val="0"/>
+                <w:numId w:val="0"/>
+              </w:numPr>
+              <w:jc w:val="center"/>
+              <w:rPr>
+                <w:lang w:val="en-CA"/>
+              </w:rPr>
+            </w:pPr>
+          </w:p>
+        </w:tc>
+        <w:tc>
+          <w:tcPr>
+            <w:tcW w:w="993" w:type="dxa"/>
+            <w:vAlign w:val="center"/>
+          </w:tcPr>
+          <w:p>
+            <w:pPr>
+              <w:pStyle w:val="a"/>
+              <w:numPr>
+                <w:ilvl w:val="0"/>
+                <w:numId w:val="0"/>
+              </w:numPr>
+              <w:jc w:val="center"/>
+              <w:rPr>
+                <w:rFonts w:hint="eastAsia"/>
+                <w:lang w:val="en-CA"/>
+              </w:rPr>
+            </w:pPr>
+          </w:p>
+        </w:tc>
+        <w:tc>
+          <w:tcPr>
+            <w:tcW w:w="1276" w:type="dxa"/>
+            <w:vAlign w:val="center"/>
+          </w:tcPr>
+          <w:p>
+            <w:pPr>
+              <w:pStyle w:val="a"/>
+              <w:numPr>
+                <w:ilvl w:val="0"/>
+                <w:numId w:val="0"/>
+              </w:numPr>
+              <w:jc w:val="center"/>
+              <w:rPr>
+                <w:rFonts w:hint="eastAsia"/>
+                <w:lang w:val="en-CA"/>
+              </w:rPr>
+            </w:pPr>
+          </w:p>
+        </w:tc>
+        <w:tc>
+          <w:tcPr>
+            <w:tcW w:w="708" w:type="dxa"/>
+            <w:vAlign w:val="center"/>
+          </w:tcPr>
+          <w:p>
+            <w:pPr>
+              <w:pStyle w:val="a"/>
+              <w:keepNext/>
+              <w:numPr>
+                <w:ilvl w:val="0"/>
+                <w:numId w:val="0"/>
+              </w:numPr>
+              <w:jc w:val="center"/>
+              <w:rPr>
+                <w:rFonts w:hint="eastAsia"/>
+                <w:lang w:val="en-CA"/>
+              </w:rPr>
+            </w:pPr>
+          </w:p>
+        </w:tc>
+      </w:tr>
+      <w:tr>
+        <w:trPr>
+          <w:jc w:val="center"/>
+        </w:trPr>
+        <w:tc>
+          <w:tcPr>
+            <w:tcW w:w="1276" w:type="dxa"/>
+            <w:vMerge/>
+            <w:tcBorders>
+              <w:bottom w:val="single" w:sz="4" w:space="0" w:color="auto"/>
+            </w:tcBorders>
+            <w:vAlign w:val="center"/>
+          </w:tcPr>
+          <w:p>
+            <w:pPr>
+              <w:pStyle w:val="a"/>
+              <w:numPr>
+                <w:ilvl w:val="0"/>
+                <w:numId w:val="0"/>
+              </w:numPr>
+              <w:jc w:val="center"/>
+              <w:rPr>
+                <w:rFonts w:hint="eastAsia"/>
+                <w:lang w:val="en-CA"/>
+              </w:rPr>
+            </w:pPr>
+          </w:p>
+        </w:tc>
+        <w:tc>
+          <w:tcPr>
+            <w:tcW w:w="992" w:type="dxa"/>
+            <w:tcBorders>
+              <w:bottom w:val="single" w:sz="4" w:space="0" w:color="auto"/>
+            </w:tcBorders>
+            <w:vAlign w:val="center"/>
+          </w:tcPr>
+          <w:p>
+            <w:pPr>
+              <w:pStyle w:val="a"/>
+              <w:numPr>
+                <w:ilvl w:val="0"/>
+                <w:numId w:val="0"/>
+              </w:numPr>
+              <w:jc w:val="center"/>
+              <w:rPr>
+                <w:rFonts w:hint="eastAsia"/>
+                <w:lang w:val="en-CA"/>
+              </w:rPr>
+            </w:pPr>
+            <w:r>
+              <w:rPr>
+                <w:rFonts w:hint="eastAsia"/>
+                <w:lang w:val="en-CA"/>
+              </w:rPr>
+              <w:t>材質</w:t>
+            </w:r>
+          </w:p>
+        </w:tc>
+        <w:tc>
+          <w:tcPr>
+            <w:tcW w:w="1276" w:type="dxa"/>
+            <w:tcBorders>
+              <w:bottom w:val="single" w:sz="4" w:space="0" w:color="auto"/>
+            </w:tcBorders>
+            <w:vAlign w:val="center"/>
+          </w:tcPr>
+          <w:p>
+            <w:pPr>
+              <w:pStyle w:val="a"/>
+              <w:numPr>
+                <w:ilvl w:val="0"/>
+                <w:numId w:val="0"/>
+              </w:numPr>
+              <w:jc w:val="center"/>
+              <w:rPr>
+                <w:rFonts w:cs="Times New Roman" w:hint="eastAsia"/>
+              </w:rPr>
+            </w:pPr>
+          </w:p>
+        </w:tc>
+        <w:tc>
+          <w:tcPr>
+            <w:tcW w:w="709" w:type="dxa"/>
+            <w:tcBorders>
+              <w:bottom w:val="single" w:sz="4" w:space="0" w:color="auto"/>
+            </w:tcBorders>
+            <w:vAlign w:val="center"/>
+          </w:tcPr>
+          <w:p>
+            <w:pPr>
+              <w:pStyle w:val="a"/>
+              <w:numPr>
+                <w:ilvl w:val="0"/>
+                <w:numId w:val="0"/>
+              </w:numPr>
+              <w:jc w:val="center"/>
+              <w:rPr>
+                <w:rFonts w:cs="Times New Roman"/>
+              </w:rPr>
+            </w:pPr>
+            <w:r>
+              <w:rPr>
+                <w:rFonts w:cs="Times New Roman" w:hint="eastAsia"/>
+              </w:rPr>
+              <w:t>-</w:t>
+            </w:r>
+          </w:p>
+        </w:tc>
+        <w:tc>
+          <w:tcPr>
+            <w:tcW w:w="236" w:type="dxa"/>
+          </w:tcPr>
+          <w:p>
+            <w:pPr>
+              <w:pStyle w:val="a"/>
+              <w:numPr>
+                <w:ilvl w:val="0"/>
+                <w:numId w:val="0"/>
+              </w:numPr>
+              <w:jc w:val="center"/>
+              <w:rPr>
+                <w:lang w:val="en-CA"/>
+              </w:rPr>
+            </w:pPr>
+          </w:p>
+        </w:tc>
+        <w:tc>
+          <w:tcPr>
+            <w:tcW w:w="1039" w:type="dxa"/>
+            <w:tcBorders>
+              <w:bottom w:val="single" w:sz="4" w:space="0" w:color="auto"/>
+            </w:tcBorders>
+            <w:vAlign w:val="center"/>
+          </w:tcPr>
+          <w:p>
+            <w:pPr>
+              <w:pStyle w:val="a"/>
+              <w:numPr>
+                <w:ilvl w:val="0"/>
+                <w:numId w:val="0"/>
+              </w:numPr>
+              <w:jc w:val="center"/>
+              <w:rPr>
+                <w:lang w:val="en-CA"/>
+              </w:rPr>
+            </w:pPr>
+          </w:p>
+        </w:tc>
+        <w:tc>
+          <w:tcPr>
+            <w:tcW w:w="993" w:type="dxa"/>
+            <w:tcBorders>
+              <w:bottom w:val="single" w:sz="4" w:space="0" w:color="auto"/>
+            </w:tcBorders>
+            <w:vAlign w:val="center"/>
+          </w:tcPr>
+          <w:p>
+            <w:pPr>
+              <w:pStyle w:val="a"/>
+              <w:numPr>
+                <w:ilvl w:val="0"/>
+                <w:numId w:val="0"/>
+              </w:numPr>
+              <w:jc w:val="center"/>
+              <w:rPr>
+                <w:rFonts w:hint="eastAsia"/>
+                <w:lang w:val="en-CA"/>
+              </w:rPr>
+            </w:pPr>
+          </w:p>
+        </w:tc>
+        <w:tc>
+          <w:tcPr>
+            <w:tcW w:w="1276" w:type="dxa"/>
+            <w:tcBorders>
+              <w:bottom w:val="single" w:sz="4" w:space="0" w:color="auto"/>
+            </w:tcBorders>
+            <w:vAlign w:val="center"/>
+          </w:tcPr>
+          <w:p>
+            <w:pPr>
+              <w:pStyle w:val="a"/>
+              <w:numPr>
+                <w:ilvl w:val="0"/>
+                <w:numId w:val="0"/>
+              </w:numPr>
+              <w:jc w:val="center"/>
+              <w:rPr>
+                <w:rFonts w:hint="eastAsia"/>
+                <w:lang w:val="en-CA"/>
+              </w:rPr>
+            </w:pPr>
+          </w:p>
+        </w:tc>
+        <w:tc>
+          <w:tcPr>
+            <w:tcW w:w="708" w:type="dxa"/>
+            <w:tcBorders>
+              <w:bottom w:val="single" w:sz="4" w:space="0" w:color="auto"/>
+            </w:tcBorders>
+            <w:vAlign w:val="center"/>
+          </w:tcPr>
+          <w:p>
+            <w:pPr>
+              <w:pStyle w:val="a"/>
+              <w:keepNext/>
+              <w:numPr>
+                <w:ilvl w:val="0"/>
+                <w:numId w:val="0"/>
+              </w:numPr>
+              <w:jc w:val="center"/>
+              <w:rPr>
+                <w:rFonts w:hint="eastAsia"/>
                 <w:lang w:val="en-CA"/>
               </w:rPr>
             </w:pPr>
@@ -5123,10 +6104,10 @@
                 <w:position w:val="-14"/>
               </w:rPr>
               <w:object w:dxaOrig="1060" w:dyaOrig="380" w14:anchorId="1534179E">
-                <v:shape id="_x0000_i1038" type="#_x0000_t75" style="width:53.25pt;height:18.75pt" o:ole="">
+                <v:shape id="_x0000_i1038" type="#_x0000_t75" style="width:53pt;height:19pt" o:ole="">
                   <v:imagedata r:id="rId38" o:title=""/>
                 </v:shape>
-                <o:OLEObject Type="Embed" ProgID="Equation.DSMT4" ShapeID="_x0000_i1038" DrawAspect="Content" ObjectID="_1835707761" r:id="rId39"/>
+                <o:OLEObject Type="Embed" ProgID="Equation.DSMT4" ShapeID="_x0000_i1038" DrawAspect="Content" ObjectID="_1835817378" r:id="rId39"/>
               </w:object>
             </w:r>
           </w:p>
@@ -5165,10 +6146,10 @@
                 <w:position w:val="-14"/>
               </w:rPr>
               <w:object w:dxaOrig="740" w:dyaOrig="380" w14:anchorId="0A7AD222">
-                <v:shape id="_x0000_i1039" type="#_x0000_t75" style="width:36.75pt;height:18.75pt" o:ole="">
+                <v:shape id="_x0000_i1039" type="#_x0000_t75" style="width:36.85pt;height:19pt" o:ole="">
                   <v:imagedata r:id="rId40" o:title=""/>
                 </v:shape>
-                <o:OLEObject Type="Embed" ProgID="Equation.DSMT4" ShapeID="_x0000_i1039" DrawAspect="Content" ObjectID="_1835707762" r:id="rId41"/>
+                <o:OLEObject Type="Embed" ProgID="Equation.DSMT4" ShapeID="_x0000_i1039" DrawAspect="Content" ObjectID="_1835817379" r:id="rId41"/>
               </w:object>
             </w:r>
           </w:p>
@@ -5221,10 +6202,10 @@
                 <w:lang w:val="en-CA"/>
               </w:rPr>
               <w:object w:dxaOrig="960" w:dyaOrig="760" w14:anchorId="24DC0BA4">
-                <v:shape id="_x0000_i1040" type="#_x0000_t75" style="width:48pt;height:38.25pt" o:ole="">
+                <v:shape id="_x0000_i1040" type="#_x0000_t75" style="width:47.8pt;height:38pt" o:ole="">
                   <v:imagedata r:id="rId42" o:title=""/>
                 </v:shape>
-                <o:OLEObject Type="Embed" ProgID="Equation.DSMT4" ShapeID="_x0000_i1040" DrawAspect="Content" ObjectID="_1835707763" r:id="rId43"/>
+                <o:OLEObject Type="Embed" ProgID="Equation.DSMT4" ShapeID="_x0000_i1040" DrawAspect="Content" ObjectID="_1835817380" r:id="rId43"/>
               </w:object>
             </w:r>
           </w:p>
@@ -5250,6 +6231,7 @@
                 <w:iCs/>
                 <w:lang w:val="en-CA"/>
               </w:rPr>
+              <w:lastRenderedPageBreak/>
               <w:t>物理合理性</w:t>
             </w:r>
             <w:r>
@@ -5280,10 +6262,10 @@
                 <w:lang w:val="en-CA"/>
               </w:rPr>
               <w:object w:dxaOrig="2659" w:dyaOrig="1420" w14:anchorId="28B74947">
-                <v:shape id="_x0000_i1041" type="#_x0000_t75" style="width:132.75pt;height:71.25pt" o:ole="">
+                <v:shape id="_x0000_i1041" type="#_x0000_t75" style="width:132.5pt;height:71.4pt" o:ole="">
                   <v:imagedata r:id="rId44" o:title=""/>
                 </v:shape>
-                <o:OLEObject Type="Embed" ProgID="Equation.DSMT4" ShapeID="_x0000_i1041" DrawAspect="Content" ObjectID="_1835707764" r:id="rId45"/>
+                <o:OLEObject Type="Embed" ProgID="Equation.DSMT4" ShapeID="_x0000_i1041" DrawAspect="Content" ObjectID="_1835817381" r:id="rId45"/>
               </w:object>
             </w:r>
           </w:p>
@@ -5307,7 +6289,6 @@
                 <w:rFonts w:hint="eastAsia"/>
                 <w:lang w:val="en-CA"/>
               </w:rPr>
-              <w:lastRenderedPageBreak/>
               <w:t>自調節機構設置</w:t>
             </w:r>
           </w:p>
@@ -5326,13 +6307,13 @@
             </w:pPr>
             <w:r>
               <w:rPr>
-                <w:position w:val="-112"/>
-              </w:rPr>
-              <w:object w:dxaOrig="4140" w:dyaOrig="2260" w14:anchorId="3DB9CF55">
-                <v:shape id="_x0000_i1067" type="#_x0000_t75" style="width:206.25pt;height:112.5pt" o:ole="">
+                <w:position w:val="-124"/>
+              </w:rPr>
+              <w:object w:dxaOrig="4140" w:dyaOrig="2600" w14:anchorId="3DB9CF55">
+                <v:shape id="_x0000_i1071" type="#_x0000_t75" style="width:206.2pt;height:129.6pt" o:ole="">
                   <v:imagedata r:id="rId46" o:title=""/>
                 </v:shape>
-                <o:OLEObject Type="Embed" ProgID="Equation.DSMT4" ShapeID="_x0000_i1067" DrawAspect="Content" ObjectID="_1835707765" r:id="rId47"/>
+                <o:OLEObject Type="Embed" ProgID="Equation.DSMT4" ShapeID="_x0000_i1071" DrawAspect="Content" ObjectID="_1835817382" r:id="rId47"/>
               </w:object>
             </w:r>
           </w:p>
@@ -5352,11 +6333,11 @@
         <w:rPr>
           <w:position w:val="-16"/>
         </w:rPr>
-        <w:object w:dxaOrig="2680" w:dyaOrig="440" w14:anchorId="5C2001B6">
-          <v:shape id="_x0000_i1043" type="#_x0000_t75" style="width:133.5pt;height:21.75pt" o:ole="">
+        <w:object w:dxaOrig="2780" w:dyaOrig="440" w14:anchorId="5C2001B6">
+          <v:shape id="_x0000_i1067" type="#_x0000_t75" style="width:138.25pt;height:21.9pt" o:ole="">
             <v:imagedata r:id="rId48" o:title=""/>
           </v:shape>
-          <o:OLEObject Type="Embed" ProgID="Equation.DSMT4" ShapeID="_x0000_i1043" DrawAspect="Content" ObjectID="_1835707766" r:id="rId49"/>
+          <o:OLEObject Type="Embed" ProgID="Equation.DSMT4" ShapeID="_x0000_i1067" DrawAspect="Content" ObjectID="_1835817383" r:id="rId49"/>
         </w:object>
       </w:r>
     </w:p>
@@ -6943,10 +7924,10 @@
                 <w:position w:val="-12"/>
               </w:rPr>
               <w:object w:dxaOrig="220" w:dyaOrig="360" w14:anchorId="1A82F333">
-                <v:shape id="_x0000_i1044" type="#_x0000_t75" style="width:11.25pt;height:18pt" o:ole="">
+                <v:shape id="_x0000_i1044" type="#_x0000_t75" style="width:11.5pt;height:17.85pt" o:ole="">
                   <v:imagedata r:id="rId52" o:title=""/>
                 </v:shape>
-                <o:OLEObject Type="Embed" ProgID="Equation.DSMT4" ShapeID="_x0000_i1044" DrawAspect="Content" ObjectID="_1835707767" r:id="rId53"/>
+                <o:OLEObject Type="Embed" ProgID="Equation.DSMT4" ShapeID="_x0000_i1044" DrawAspect="Content" ObjectID="_1835817384" r:id="rId53"/>
               </w:object>
             </w:r>
           </w:p>
@@ -6986,10 +7967,10 @@
                 <w:position w:val="-10"/>
               </w:rPr>
               <w:object w:dxaOrig="1140" w:dyaOrig="320" w14:anchorId="2CB8AD2B">
-                <v:shape id="_x0000_i1045" type="#_x0000_t75" style="width:57.75pt;height:15.75pt" o:ole="">
+                <v:shape id="_x0000_i1045" type="#_x0000_t75" style="width:57.6pt;height:15.55pt" o:ole="">
                   <v:imagedata r:id="rId54" o:title=""/>
                 </v:shape>
-                <o:OLEObject Type="Embed" ProgID="Equation.DSMT4" ShapeID="_x0000_i1045" DrawAspect="Content" ObjectID="_1835707768" r:id="rId55"/>
+                <o:OLEObject Type="Embed" ProgID="Equation.DSMT4" ShapeID="_x0000_i1045" DrawAspect="Content" ObjectID="_1835817385" r:id="rId55"/>
               </w:object>
             </w:r>
           </w:p>
@@ -7051,10 +8032,10 @@
                 <w:position w:val="-6"/>
               </w:rPr>
               <w:object w:dxaOrig="200" w:dyaOrig="279" w14:anchorId="057115D2">
-                <v:shape id="_x0000_i1046" type="#_x0000_t75" style="width:10.5pt;height:14.25pt" o:ole="">
+                <v:shape id="_x0000_i1046" type="#_x0000_t75" style="width:10.35pt;height:14.4pt" o:ole="">
                   <v:imagedata r:id="rId56" o:title=""/>
                 </v:shape>
-                <o:OLEObject Type="Embed" ProgID="Equation.DSMT4" ShapeID="_x0000_i1046" DrawAspect="Content" ObjectID="_1835707769" r:id="rId57"/>
+                <o:OLEObject Type="Embed" ProgID="Equation.DSMT4" ShapeID="_x0000_i1046" DrawAspect="Content" ObjectID="_1835817386" r:id="rId57"/>
               </w:object>
             </w:r>
           </w:p>
@@ -7607,10 +8588,10 @@
           <w:position w:val="-12"/>
         </w:rPr>
         <w:object w:dxaOrig="279" w:dyaOrig="360" w14:anchorId="43D80298">
-          <v:shape id="_x0000_i1047" type="#_x0000_t75" style="width:13.5pt;height:18pt" o:ole="">
+          <v:shape id="_x0000_i1047" type="#_x0000_t75" style="width:13.25pt;height:17.85pt" o:ole="">
             <v:imagedata r:id="rId58" o:title=""/>
           </v:shape>
-          <o:OLEObject Type="Embed" ProgID="Equation.DSMT4" ShapeID="_x0000_i1047" DrawAspect="Content" ObjectID="_1835707770" r:id="rId59"/>
+          <o:OLEObject Type="Embed" ProgID="Equation.DSMT4" ShapeID="_x0000_i1047" DrawAspect="Content" ObjectID="_1835817387" r:id="rId59"/>
         </w:object>
       </w:r>
       <w:r>
@@ -7627,10 +8608,10 @@
           <w:position w:val="-14"/>
         </w:rPr>
         <w:object w:dxaOrig="580" w:dyaOrig="380" w14:anchorId="50E84EFE">
-          <v:shape id="_x0000_i1048" type="#_x0000_t75" style="width:28.5pt;height:18.75pt" o:ole="">
+          <v:shape id="_x0000_i1048" type="#_x0000_t75" style="width:28.2pt;height:19pt" o:ole="">
             <v:imagedata r:id="rId60" o:title=""/>
           </v:shape>
-          <o:OLEObject Type="Embed" ProgID="Equation.DSMT4" ShapeID="_x0000_i1048" DrawAspect="Content" ObjectID="_1835707771" r:id="rId61"/>
+          <o:OLEObject Type="Embed" ProgID="Equation.DSMT4" ShapeID="_x0000_i1048" DrawAspect="Content" ObjectID="_1835817388" r:id="rId61"/>
         </w:object>
       </w:r>
     </w:p>
@@ -7766,7 +8747,21 @@
         <w:rPr>
           <w:rFonts w:hint="eastAsia"/>
         </w:rPr>
-        <w:t>、凸函數。</w:t>
+        <w:t>、</w:t>
+      </w:r>
+      <w:proofErr w:type="gramStart"/>
+      <w:r>
+        <w:rPr>
+          <w:rFonts w:hint="eastAsia"/>
+        </w:rPr>
+        <w:t>凸</w:t>
+      </w:r>
+      <w:proofErr w:type="gramEnd"/>
+      <w:r>
+        <w:rPr>
+          <w:rFonts w:hint="eastAsia"/>
+        </w:rPr>
+        <w:t>函數。</w:t>
       </w:r>
     </w:p>
     <w:tbl>
@@ -8623,6 +9618,7 @@
         <w:rPr>
           <w:rFonts w:hint="eastAsia"/>
         </w:rPr>
+        <w:lastRenderedPageBreak/>
         <w:t>電磁模型</w:t>
       </w:r>
     </w:p>
@@ -8647,7 +9643,6 @@
         <w:t xml:space="preserve"> </w:t>
       </w:r>
       <w:r>
-        <w:lastRenderedPageBreak/>
         <w:t>FEM)</w:t>
       </w:r>
       <w:r>
@@ -8831,10 +9826,10 @@
           <w:lang w:val="en-CA"/>
         </w:rPr>
         <w:object w:dxaOrig="300" w:dyaOrig="360" w14:anchorId="5B1A89B0">
-          <v:shape id="_x0000_i1049" type="#_x0000_t75" style="width:15pt;height:18pt" o:ole="">
+          <v:shape id="_x0000_i1049" type="#_x0000_t75" style="width:15pt;height:17.85pt" o:ole="">
             <v:imagedata r:id="rId62" o:title=""/>
           </v:shape>
-          <o:OLEObject Type="Embed" ProgID="Equation.DSMT4" ShapeID="_x0000_i1049" DrawAspect="Content" ObjectID="_1835707772" r:id="rId63"/>
+          <o:OLEObject Type="Embed" ProgID="Equation.DSMT4" ShapeID="_x0000_i1049" DrawAspect="Content" ObjectID="_1835817389" r:id="rId63"/>
         </w:object>
       </w:r>
       <w:r>
@@ -8870,10 +9865,10 @@
           <w:position w:val="-14"/>
         </w:rPr>
         <w:object w:dxaOrig="720" w:dyaOrig="400" w14:anchorId="0197B666">
-          <v:shape id="_x0000_i1050" type="#_x0000_t75" style="width:36pt;height:20.25pt" o:ole="">
+          <v:shape id="_x0000_i1050" type="#_x0000_t75" style="width:36.3pt;height:20.15pt" o:ole="">
             <v:imagedata r:id="rId64" o:title=""/>
           </v:shape>
-          <o:OLEObject Type="Embed" ProgID="Equation.DSMT4" ShapeID="_x0000_i1050" DrawAspect="Content" ObjectID="_1835707773" r:id="rId65"/>
+          <o:OLEObject Type="Embed" ProgID="Equation.DSMT4" ShapeID="_x0000_i1050" DrawAspect="Content" ObjectID="_1835817390" r:id="rId65"/>
         </w:object>
       </w:r>
       <w:r>
@@ -8897,7 +9892,7 @@
             <v:imagedata r:id="rId66" o:title=""/>
             <w10:wrap type="square" side="left"/>
           </v:shape>
-          <o:OLEObject Type="Embed" ProgID="Equation.DSMT4" ShapeID="_x0000_s2076" DrawAspect="Content" ObjectID="_1835707788" r:id="rId67"/>
+          <o:OLEObject Type="Embed" ProgID="Equation.DSMT4" ShapeID="_x0000_s2076" DrawAspect="Content" ObjectID="_1835817405" r:id="rId67"/>
         </w:object>
       </w:r>
       <w:r>
@@ -8926,10 +9921,10 @@
           <w:position w:val="-12"/>
         </w:rPr>
         <w:object w:dxaOrig="300" w:dyaOrig="360" w14:anchorId="02AB2D16">
-          <v:shape id="_x0000_i1052" type="#_x0000_t75" style="width:15pt;height:18pt" o:ole="">
+          <v:shape id="_x0000_i1052" type="#_x0000_t75" style="width:15pt;height:17.85pt" o:ole="">
             <v:imagedata r:id="rId68" o:title=""/>
           </v:shape>
-          <o:OLEObject Type="Embed" ProgID="Equation.DSMT4" ShapeID="_x0000_i1052" DrawAspect="Content" ObjectID="_1835707774" r:id="rId69"/>
+          <o:OLEObject Type="Embed" ProgID="Equation.DSMT4" ShapeID="_x0000_i1052" DrawAspect="Content" ObjectID="_1835817391" r:id="rId69"/>
         </w:object>
       </w:r>
       <w:r>
@@ -8954,10 +9949,10 @@
           <w:lang w:val="en-CA" w:eastAsia="ja-JP"/>
         </w:rPr>
         <w:object w:dxaOrig="1420" w:dyaOrig="400" w14:anchorId="51E203EF">
-          <v:shape id="_x0000_i1053" type="#_x0000_t75" style="width:71.25pt;height:20.25pt" o:ole="">
+          <v:shape id="_x0000_i1053" type="#_x0000_t75" style="width:71.4pt;height:20.15pt" o:ole="">
             <v:imagedata r:id="rId70" o:title=""/>
           </v:shape>
-          <o:OLEObject Type="Embed" ProgID="Equation.DSMT4" ShapeID="_x0000_i1053" DrawAspect="Content" ObjectID="_1835707775" r:id="rId71"/>
+          <o:OLEObject Type="Embed" ProgID="Equation.DSMT4" ShapeID="_x0000_i1053" DrawAspect="Content" ObjectID="_1835817392" r:id="rId71"/>
         </w:object>
       </w:r>
     </w:p>
@@ -8987,10 +9982,10 @@
           <w:position w:val="-12"/>
         </w:rPr>
         <w:object w:dxaOrig="460" w:dyaOrig="360" w14:anchorId="6937A4A1">
-          <v:shape id="_x0000_i1054" type="#_x0000_t75" style="width:23.25pt;height:18pt" o:ole="">
+          <v:shape id="_x0000_i1054" type="#_x0000_t75" style="width:23.05pt;height:17.85pt" o:ole="">
             <v:imagedata r:id="rId72" o:title=""/>
           </v:shape>
-          <o:OLEObject Type="Embed" ProgID="Equation.DSMT4" ShapeID="_x0000_i1054" DrawAspect="Content" ObjectID="_1835707776" r:id="rId73"/>
+          <o:OLEObject Type="Embed" ProgID="Equation.DSMT4" ShapeID="_x0000_i1054" DrawAspect="Content" ObjectID="_1835817393" r:id="rId73"/>
         </w:object>
       </w:r>
     </w:p>
@@ -9003,10 +9998,10 @@
           <w:position w:val="-32"/>
         </w:rPr>
         <w:object w:dxaOrig="5240" w:dyaOrig="720" w14:anchorId="7E9A67C7">
-          <v:shape id="_x0000_i1055" type="#_x0000_t75" style="width:263.25pt;height:36pt" o:ole="">
+          <v:shape id="_x0000_i1055" type="#_x0000_t75" style="width:263.25pt;height:36.3pt" o:ole="">
             <v:imagedata r:id="rId74" o:title=""/>
           </v:shape>
-          <o:OLEObject Type="Embed" ProgID="Equation.DSMT4" ShapeID="_x0000_i1055" DrawAspect="Content" ObjectID="_1835707777" r:id="rId75"/>
+          <o:OLEObject Type="Embed" ProgID="Equation.DSMT4" ShapeID="_x0000_i1055" DrawAspect="Content" ObjectID="_1835817394" r:id="rId75"/>
         </w:object>
       </w:r>
     </w:p>
@@ -9030,10 +10025,10 @@
           <w:position w:val="-12"/>
         </w:rPr>
         <w:object w:dxaOrig="279" w:dyaOrig="360" w14:anchorId="45108477">
-          <v:shape id="_x0000_i1056" type="#_x0000_t75" style="width:14.25pt;height:18pt" o:ole="">
+          <v:shape id="_x0000_i1056" type="#_x0000_t75" style="width:14.4pt;height:17.85pt" o:ole="">
             <v:imagedata r:id="rId76" o:title=""/>
           </v:shape>
-          <o:OLEObject Type="Embed" ProgID="Equation.DSMT4" ShapeID="_x0000_i1056" DrawAspect="Content" ObjectID="_1835707778" r:id="rId77"/>
+          <o:OLEObject Type="Embed" ProgID="Equation.DSMT4" ShapeID="_x0000_i1056" DrawAspect="Content" ObjectID="_1835817395" r:id="rId77"/>
         </w:object>
       </w:r>
     </w:p>
@@ -9102,10 +10097,10 @@
           <w:position w:val="-4"/>
         </w:rPr>
         <w:object w:dxaOrig="180" w:dyaOrig="320" w14:anchorId="63BA0373">
-          <v:shape id="_x0000_i1057" type="#_x0000_t75" style="width:9pt;height:15.75pt" o:ole="">
+          <v:shape id="_x0000_i1057" type="#_x0000_t75" style="width:9.2pt;height:15.55pt" o:ole="">
             <v:imagedata r:id="rId79" o:title=""/>
           </v:shape>
-          <o:OLEObject Type="Embed" ProgID="Equation.DSMT4" ShapeID="_x0000_i1057" DrawAspect="Content" ObjectID="_1835707779" r:id="rId80"/>
+          <o:OLEObject Type="Embed" ProgID="Equation.DSMT4" ShapeID="_x0000_i1057" DrawAspect="Content" ObjectID="_1835817396" r:id="rId80"/>
         </w:object>
       </w:r>
     </w:p>
@@ -9121,6 +10116,7 @@
           <w:noProof/>
           <w:lang w:val="en-CA"/>
         </w:rPr>
+        <w:lastRenderedPageBreak/>
         <w:drawing>
           <wp:inline distT="0" distB="0" distL="0" distR="0" wp14:anchorId="3A97ECBA" wp14:editId="716172EF">
             <wp:extent cx="5191850" cy="1124107"/>
@@ -9180,10 +10176,10 @@
           <w:position w:val="-4"/>
         </w:rPr>
         <w:object w:dxaOrig="220" w:dyaOrig="260" w14:anchorId="100CF53C">
-          <v:shape id="_x0000_i1058" type="#_x0000_t75" style="width:11.25pt;height:12.75pt" o:ole="">
+          <v:shape id="_x0000_i1058" type="#_x0000_t75" style="width:11.5pt;height:12.65pt" o:ole="">
             <v:imagedata r:id="rId82" o:title=""/>
           </v:shape>
-          <o:OLEObject Type="Embed" ProgID="Equation.DSMT4" ShapeID="_x0000_i1058" DrawAspect="Content" ObjectID="_1835707780" r:id="rId83"/>
+          <o:OLEObject Type="Embed" ProgID="Equation.DSMT4" ShapeID="_x0000_i1058" DrawAspect="Content" ObjectID="_1835817397" r:id="rId83"/>
         </w:object>
       </w:r>
     </w:p>
@@ -9199,7 +10195,6 @@
           <w:noProof/>
           <w:lang w:val="en-CA"/>
         </w:rPr>
-        <w:lastRenderedPageBreak/>
         <w:drawing>
           <wp:inline distT="0" distB="0" distL="0" distR="0" wp14:anchorId="79864ABC" wp14:editId="358F3767">
             <wp:extent cx="4826635" cy="686282"/>
@@ -9329,10 +10324,10 @@
           <w:lang w:val="en-CA"/>
         </w:rPr>
         <w:object w:dxaOrig="380" w:dyaOrig="360" w14:anchorId="45596AD0">
-          <v:shape id="_x0000_i1059" type="#_x0000_t75" style="width:18.75pt;height:18pt" o:ole="">
+          <v:shape id="_x0000_i1059" type="#_x0000_t75" style="width:19pt;height:17.85pt" o:ole="">
             <v:imagedata r:id="rId85" o:title=""/>
           </v:shape>
-          <o:OLEObject Type="Embed" ProgID="Equation.DSMT4" ShapeID="_x0000_i1059" DrawAspect="Content" ObjectID="_1835707781" r:id="rId86"/>
+          <o:OLEObject Type="Embed" ProgID="Equation.DSMT4" ShapeID="_x0000_i1059" DrawAspect="Content" ObjectID="_1835817398" r:id="rId86"/>
         </w:object>
       </w:r>
       <w:r>
@@ -9347,10 +10342,10 @@
           <w:position w:val="-12"/>
         </w:rPr>
         <w:object w:dxaOrig="340" w:dyaOrig="360" w14:anchorId="5C4B5AFE">
-          <v:shape id="_x0000_i1060" type="#_x0000_t75" style="width:17.25pt;height:18pt" o:ole="">
+          <v:shape id="_x0000_i1060" type="#_x0000_t75" style="width:17.3pt;height:17.85pt" o:ole="">
             <v:imagedata r:id="rId87" o:title=""/>
           </v:shape>
-          <o:OLEObject Type="Embed" ProgID="Equation.DSMT4" ShapeID="_x0000_i1060" DrawAspect="Content" ObjectID="_1835707782" r:id="rId88"/>
+          <o:OLEObject Type="Embed" ProgID="Equation.DSMT4" ShapeID="_x0000_i1060" DrawAspect="Content" ObjectID="_1835817399" r:id="rId88"/>
         </w:object>
       </w:r>
     </w:p>
@@ -9404,10 +10399,10 @@
                 <w:position w:val="-14"/>
               </w:rPr>
               <w:object w:dxaOrig="2680" w:dyaOrig="380" w14:anchorId="5C51C19D">
-                <v:shape id="_x0000_i1061" type="#_x0000_t75" style="width:132.75pt;height:18.75pt" o:ole="">
+                <v:shape id="_x0000_i1061" type="#_x0000_t75" style="width:133.05pt;height:19pt" o:ole="">
                   <v:imagedata r:id="rId89" o:title=""/>
                 </v:shape>
-                <o:OLEObject Type="Embed" ProgID="Equation.DSMT4" ShapeID="_x0000_i1061" DrawAspect="Content" ObjectID="_1835707783" r:id="rId90"/>
+                <o:OLEObject Type="Embed" ProgID="Equation.DSMT4" ShapeID="_x0000_i1061" DrawAspect="Content" ObjectID="_1835817400" r:id="rId90"/>
               </w:object>
             </w:r>
           </w:p>
@@ -9505,10 +10500,10 @@
                 <w:position w:val="-32"/>
               </w:rPr>
               <w:object w:dxaOrig="4840" w:dyaOrig="760" w14:anchorId="4F025134">
-                <v:shape id="_x0000_i1062" type="#_x0000_t75" style="width:242.25pt;height:38.25pt" o:ole="">
+                <v:shape id="_x0000_i1062" type="#_x0000_t75" style="width:242.5pt;height:38pt" o:ole="">
                   <v:imagedata r:id="rId91" o:title=""/>
                 </v:shape>
-                <o:OLEObject Type="Embed" ProgID="Equation.DSMT4" ShapeID="_x0000_i1062" DrawAspect="Content" ObjectID="_1835707784" r:id="rId92"/>
+                <o:OLEObject Type="Embed" ProgID="Equation.DSMT4" ShapeID="_x0000_i1062" DrawAspect="Content" ObjectID="_1835817401" r:id="rId92"/>
               </w:object>
             </w:r>
           </w:p>
@@ -9593,10 +10588,10 @@
           <w:lang w:val="en-US"/>
         </w:rPr>
         <w:object w:dxaOrig="400" w:dyaOrig="380" w14:anchorId="03A4AA7B">
-          <v:shape id="_x0000_i1063" type="#_x0000_t75" style="width:20.25pt;height:18.75pt" o:ole="">
+          <v:shape id="_x0000_i1063" type="#_x0000_t75" style="width:20.15pt;height:19pt" o:ole="">
             <v:imagedata r:id="rId93" o:title=""/>
           </v:shape>
-          <o:OLEObject Type="Embed" ProgID="Equation.DSMT4" ShapeID="_x0000_i1063" DrawAspect="Content" ObjectID="_1835707785" r:id="rId94"/>
+          <o:OLEObject Type="Embed" ProgID="Equation.DSMT4" ShapeID="_x0000_i1063" DrawAspect="Content" ObjectID="_1835817402" r:id="rId94"/>
         </w:object>
       </w:r>
       <w:r>
@@ -9714,10 +10709,10 @@
                 <w:position w:val="-38"/>
               </w:rPr>
               <w:object w:dxaOrig="3420" w:dyaOrig="880" w14:anchorId="04B30234">
-                <v:shape id="_x0000_i1064" type="#_x0000_t75" style="width:171pt;height:43.5pt" o:ole="">
+                <v:shape id="_x0000_i1064" type="#_x0000_t75" style="width:171.05pt;height:43.8pt" o:ole="">
                   <v:imagedata r:id="rId95" o:title=""/>
                 </v:shape>
-                <o:OLEObject Type="Embed" ProgID="Equation.DSMT4" ShapeID="_x0000_i1064" DrawAspect="Content" ObjectID="_1835707786" r:id="rId96"/>
+                <o:OLEObject Type="Embed" ProgID="Equation.DSMT4" ShapeID="_x0000_i1064" DrawAspect="Content" ObjectID="_1835817403" r:id="rId96"/>
               </w:object>
             </w:r>
           </w:p>
@@ -10019,10 +11014,10 @@
                 <w:position w:val="-36"/>
               </w:rPr>
               <w:object w:dxaOrig="5840" w:dyaOrig="800" w14:anchorId="0C169691">
-                <v:shape id="_x0000_i1065" type="#_x0000_t75" style="width:291.75pt;height:40.5pt" o:ole="">
+                <v:shape id="_x0000_i1065" type="#_x0000_t75" style="width:291.45pt;height:40.3pt" o:ole="">
                   <v:imagedata r:id="rId97" o:title=""/>
                 </v:shape>
-                <o:OLEObject Type="Embed" ProgID="Equation.DSMT4" ShapeID="_x0000_i1065" DrawAspect="Content" ObjectID="_1835707787" r:id="rId98"/>
+                <o:OLEObject Type="Embed" ProgID="Equation.DSMT4" ShapeID="_x0000_i1065" DrawAspect="Content" ObjectID="_1835817404" r:id="rId98"/>
               </w:object>
             </w:r>
           </w:p>
@@ -10186,7 +11181,7 @@
   <w:abstractNum w:abstractNumId="0" w15:restartNumberingAfterBreak="0">
     <w:nsid w:val="FFFFFF89"/>
     <w:multiLevelType w:val="singleLevel"/>
-    <w:tmpl w:val="6E4A78F8"/>
+    <w:tmpl w:val="E83282EC"/>
     <w:lvl w:ilvl="0">
       <w:start w:val="1"/>
       <w:numFmt w:val="bullet"/>
@@ -10928,6 +11923,146 @@
     </w:lvl>
   </w:abstractNum>
   <w:abstractNum w:abstractNumId="9" w15:restartNumberingAfterBreak="0">
+    <w:nsid w:val="59571D0B"/>
+    <w:multiLevelType w:val="hybridMultilevel"/>
+    <w:tmpl w:val="D3E81EDE"/>
+    <w:lvl w:ilvl="0" w:tplc="9926E8DC">
+      <w:start w:val="1"/>
+      <w:numFmt w:val="bullet"/>
+      <w:lvlText w:val="•"/>
+      <w:lvlJc w:val="left"/>
+      <w:pPr>
+        <w:tabs>
+          <w:tab w:val="num" w:pos="720"/>
+        </w:tabs>
+        <w:ind w:left="720" w:hanging="360"/>
+      </w:pPr>
+      <w:rPr>
+        <w:rFonts w:ascii="Arial" w:hAnsi="Arial" w:hint="default"/>
+      </w:rPr>
+    </w:lvl>
+    <w:lvl w:ilvl="1" w:tplc="03E24776" w:tentative="1">
+      <w:start w:val="1"/>
+      <w:numFmt w:val="bullet"/>
+      <w:lvlText w:val="•"/>
+      <w:lvlJc w:val="left"/>
+      <w:pPr>
+        <w:tabs>
+          <w:tab w:val="num" w:pos="1440"/>
+        </w:tabs>
+        <w:ind w:left="1440" w:hanging="360"/>
+      </w:pPr>
+      <w:rPr>
+        <w:rFonts w:ascii="Arial" w:hAnsi="Arial" w:hint="default"/>
+      </w:rPr>
+    </w:lvl>
+    <w:lvl w:ilvl="2" w:tplc="E7E82CAE" w:tentative="1">
+      <w:start w:val="1"/>
+      <w:numFmt w:val="bullet"/>
+      <w:lvlText w:val="•"/>
+      <w:lvlJc w:val="left"/>
+      <w:pPr>
+        <w:tabs>
+          <w:tab w:val="num" w:pos="2160"/>
+        </w:tabs>
+        <w:ind w:left="2160" w:hanging="360"/>
+      </w:pPr>
+      <w:rPr>
+        <w:rFonts w:ascii="Arial" w:hAnsi="Arial" w:hint="default"/>
+      </w:rPr>
+    </w:lvl>
+    <w:lvl w:ilvl="3" w:tplc="997E05EE" w:tentative="1">
+      <w:start w:val="1"/>
+      <w:numFmt w:val="bullet"/>
+      <w:lvlText w:val="•"/>
+      <w:lvlJc w:val="left"/>
+      <w:pPr>
+        <w:tabs>
+          <w:tab w:val="num" w:pos="2880"/>
+        </w:tabs>
+        <w:ind w:left="2880" w:hanging="360"/>
+      </w:pPr>
+      <w:rPr>
+        <w:rFonts w:ascii="Arial" w:hAnsi="Arial" w:hint="default"/>
+      </w:rPr>
+    </w:lvl>
+    <w:lvl w:ilvl="4" w:tplc="FF089BCE" w:tentative="1">
+      <w:start w:val="1"/>
+      <w:numFmt w:val="bullet"/>
+      <w:lvlText w:val="•"/>
+      <w:lvlJc w:val="left"/>
+      <w:pPr>
+        <w:tabs>
+          <w:tab w:val="num" w:pos="3600"/>
+        </w:tabs>
+        <w:ind w:left="3600" w:hanging="360"/>
+      </w:pPr>
+      <w:rPr>
+        <w:rFonts w:ascii="Arial" w:hAnsi="Arial" w:hint="default"/>
+      </w:rPr>
+    </w:lvl>
+    <w:lvl w:ilvl="5" w:tplc="BCCECD08" w:tentative="1">
+      <w:start w:val="1"/>
+      <w:numFmt w:val="bullet"/>
+      <w:lvlText w:val="•"/>
+      <w:lvlJc w:val="left"/>
+      <w:pPr>
+        <w:tabs>
+          <w:tab w:val="num" w:pos="4320"/>
+        </w:tabs>
+        <w:ind w:left="4320" w:hanging="360"/>
+      </w:pPr>
+      <w:rPr>
+        <w:rFonts w:ascii="Arial" w:hAnsi="Arial" w:hint="default"/>
+      </w:rPr>
+    </w:lvl>
+    <w:lvl w:ilvl="6" w:tplc="2D8823BA" w:tentative="1">
+      <w:start w:val="1"/>
+      <w:numFmt w:val="bullet"/>
+      <w:lvlText w:val="•"/>
+      <w:lvlJc w:val="left"/>
+      <w:pPr>
+        <w:tabs>
+          <w:tab w:val="num" w:pos="5040"/>
+        </w:tabs>
+        <w:ind w:left="5040" w:hanging="360"/>
+      </w:pPr>
+      <w:rPr>
+        <w:rFonts w:ascii="Arial" w:hAnsi="Arial" w:hint="default"/>
+      </w:rPr>
+    </w:lvl>
+    <w:lvl w:ilvl="7" w:tplc="1A743940" w:tentative="1">
+      <w:start w:val="1"/>
+      <w:numFmt w:val="bullet"/>
+      <w:lvlText w:val="•"/>
+      <w:lvlJc w:val="left"/>
+      <w:pPr>
+        <w:tabs>
+          <w:tab w:val="num" w:pos="5760"/>
+        </w:tabs>
+        <w:ind w:left="5760" w:hanging="360"/>
+      </w:pPr>
+      <w:rPr>
+        <w:rFonts w:ascii="Arial" w:hAnsi="Arial" w:hint="default"/>
+      </w:rPr>
+    </w:lvl>
+    <w:lvl w:ilvl="8" w:tplc="D29676CC" w:tentative="1">
+      <w:start w:val="1"/>
+      <w:numFmt w:val="bullet"/>
+      <w:lvlText w:val="•"/>
+      <w:lvlJc w:val="left"/>
+      <w:pPr>
+        <w:tabs>
+          <w:tab w:val="num" w:pos="6480"/>
+        </w:tabs>
+        <w:ind w:left="6480" w:hanging="360"/>
+      </w:pPr>
+      <w:rPr>
+        <w:rFonts w:ascii="Arial" w:hAnsi="Arial" w:hint="default"/>
+      </w:rPr>
+    </w:lvl>
+  </w:abstractNum>
+  <w:abstractNum w:abstractNumId="10" w15:restartNumberingAfterBreak="0">
     <w:nsid w:val="720F6A74"/>
     <w:multiLevelType w:val="hybridMultilevel"/>
     <w:tmpl w:val="A948A7E0"/>
@@ -11016,7 +12151,7 @@
       </w:pPr>
     </w:lvl>
   </w:abstractNum>
-  <w:abstractNum w:abstractNumId="10" w15:restartNumberingAfterBreak="0">
+  <w:abstractNum w:abstractNumId="11" w15:restartNumberingAfterBreak="0">
     <w:nsid w:val="7FD319CF"/>
     <w:multiLevelType w:val="hybridMultilevel"/>
     <w:tmpl w:val="1A78B2D4"/>
@@ -11112,7 +12247,7 @@
     <w:abstractNumId w:val="6"/>
   </w:num>
   <w:num w:numId="4" w16cid:durableId="2038113387">
-    <w:abstractNumId w:val="9"/>
+    <w:abstractNumId w:val="10"/>
   </w:num>
   <w:num w:numId="5" w16cid:durableId="26223051">
     <w:abstractNumId w:val="1"/>
@@ -11124,7 +12259,7 @@
     <w:abstractNumId w:val="5"/>
   </w:num>
   <w:num w:numId="8" w16cid:durableId="1266645471">
-    <w:abstractNumId w:val="10"/>
+    <w:abstractNumId w:val="11"/>
   </w:num>
   <w:num w:numId="9" w16cid:durableId="1155493342">
     <w:abstractNumId w:val="4"/>
@@ -11134,6 +12269,9 @@
   </w:num>
   <w:num w:numId="11" w16cid:durableId="169679740">
     <w:abstractNumId w:val="2"/>
+  </w:num>
+  <w:num w:numId="12" w16cid:durableId="2100102254">
+    <w:abstractNumId w:val="9"/>
   </w:num>
 </w:numbering>
 </file>
@@ -11756,7 +12894,6 @@
   <w:style w:type="character" w:default="1" w:styleId="a1">
     <w:name w:val="Default Paragraph Font"/>
     <w:uiPriority w:val="1"/>
-    <w:semiHidden/>
     <w:unhideWhenUsed/>
   </w:style>
   <w:style w:type="table" w:default="1" w:styleId="a2">

</xml_diff>